<commit_message>
Docx builder: column widths for Table 1 so the paired values do not wrap
Co-Authored-By: Claude Fable 5.1 <noreply@anthropic.com>
Claude-Session: https://claude.ai/code/session_01A1WQ3WGcJw8tT3QK2n57xo
</commit_message>
<xml_diff>
--- a/manuscript/unityEQE_en_v2.docx
+++ b/manuscript/unityEQE_en_v2.docx
@@ -892,6 +892,7 @@
     <w:tbl>
       <w:tblPr>
         <w:tblW w:type="auto" w:w="0"/>
+        <w:tblLayout w:type="fixed"/>
         <w:tblLook w:firstColumn="1" w:firstRow="1" w:lastColumn="0" w:lastRow="0" w:noHBand="0" w:noVBand="1" w:val="04A0"/>
       </w:tblPr>
       <w:tblGrid>
@@ -907,7 +908,7 @@
       <w:tr>
         <w:tc>
           <w:tcPr>
-            <w:tcW w:type="dxa" w:w="1128"/>
+            <w:tcW w:type="dxa" w:w="1080"/>
           </w:tcPr>
           <w:p>
             <w:r/>
@@ -922,7 +923,7 @@
         </w:tc>
         <w:tc>
           <w:tcPr>
-            <w:tcW w:type="dxa" w:w="1128"/>
+            <w:tcW w:type="dxa" w:w="1008"/>
           </w:tcPr>
           <w:p>
             <w:r/>
@@ -937,7 +938,7 @@
         </w:tc>
         <w:tc>
           <w:tcPr>
-            <w:tcW w:type="dxa" w:w="1128"/>
+            <w:tcW w:type="dxa" w:w="720"/>
           </w:tcPr>
           <w:p>
             <w:r/>
@@ -952,7 +953,7 @@
         </w:tc>
         <w:tc>
           <w:tcPr>
-            <w:tcW w:type="dxa" w:w="1128"/>
+            <w:tcW w:type="dxa" w:w="1656"/>
           </w:tcPr>
           <w:p>
             <w:r/>
@@ -967,7 +968,7 @@
         </w:tc>
         <w:tc>
           <w:tcPr>
-            <w:tcW w:type="dxa" w:w="1128"/>
+            <w:tcW w:type="dxa" w:w="1440"/>
           </w:tcPr>
           <w:p>
             <w:r/>
@@ -982,7 +983,7 @@
         </w:tc>
         <w:tc>
           <w:tcPr>
-            <w:tcW w:type="dxa" w:w="1128"/>
+            <w:tcW w:type="dxa" w:w="864"/>
           </w:tcPr>
           <w:p>
             <w:r/>
@@ -997,7 +998,7 @@
         </w:tc>
         <w:tc>
           <w:tcPr>
-            <w:tcW w:type="dxa" w:w="1128"/>
+            <w:tcW w:type="dxa" w:w="1512"/>
           </w:tcPr>
           <w:p>
             <w:r/>
@@ -1012,7 +1013,7 @@
         </w:tc>
         <w:tc>
           <w:tcPr>
-            <w:tcW w:type="dxa" w:w="1128"/>
+            <w:tcW w:type="dxa" w:w="1512"/>
           </w:tcPr>
           <w:p>
             <w:r/>
@@ -1029,7 +1030,7 @@
       <w:tr>
         <w:tc>
           <w:tcPr>
-            <w:tcW w:type="dxa" w:w="1128"/>
+            <w:tcW w:type="dxa" w:w="1080"/>
           </w:tcPr>
           <w:p>
             <w:r/>
@@ -1044,7 +1045,7 @@
         </w:tc>
         <w:tc>
           <w:tcPr>
-            <w:tcW w:type="dxa" w:w="1128"/>
+            <w:tcW w:type="dxa" w:w="1008"/>
           </w:tcPr>
           <w:p>
             <w:r/>
@@ -1059,7 +1060,7 @@
         </w:tc>
         <w:tc>
           <w:tcPr>
-            <w:tcW w:type="dxa" w:w="1128"/>
+            <w:tcW w:type="dxa" w:w="720"/>
           </w:tcPr>
           <w:p>
             <w:r/>
@@ -1074,7 +1075,7 @@
         </w:tc>
         <w:tc>
           <w:tcPr>
-            <w:tcW w:type="dxa" w:w="1128"/>
+            <w:tcW w:type="dxa" w:w="1656"/>
           </w:tcPr>
           <w:p>
             <w:r/>
@@ -1089,7 +1090,7 @@
         </w:tc>
         <w:tc>
           <w:tcPr>
-            <w:tcW w:type="dxa" w:w="1128"/>
+            <w:tcW w:type="dxa" w:w="1440"/>
           </w:tcPr>
           <w:p>
             <w:r/>
@@ -1104,7 +1105,7 @@
         </w:tc>
         <w:tc>
           <w:tcPr>
-            <w:tcW w:type="dxa" w:w="1128"/>
+            <w:tcW w:type="dxa" w:w="864"/>
           </w:tcPr>
           <w:p>
             <w:r/>
@@ -1119,7 +1120,7 @@
         </w:tc>
         <w:tc>
           <w:tcPr>
-            <w:tcW w:type="dxa" w:w="1128"/>
+            <w:tcW w:type="dxa" w:w="1512"/>
           </w:tcPr>
           <w:p>
             <w:r/>
@@ -1134,7 +1135,7 @@
         </w:tc>
         <w:tc>
           <w:tcPr>
-            <w:tcW w:type="dxa" w:w="1128"/>
+            <w:tcW w:type="dxa" w:w="1512"/>
           </w:tcPr>
           <w:p>
             <w:r/>
@@ -1151,7 +1152,7 @@
       <w:tr>
         <w:tc>
           <w:tcPr>
-            <w:tcW w:type="dxa" w:w="1128"/>
+            <w:tcW w:type="dxa" w:w="1080"/>
           </w:tcPr>
           <w:p>
             <w:r/>
@@ -1166,7 +1167,7 @@
         </w:tc>
         <w:tc>
           <w:tcPr>
-            <w:tcW w:type="dxa" w:w="1128"/>
+            <w:tcW w:type="dxa" w:w="1008"/>
           </w:tcPr>
           <w:p>
             <w:r/>
@@ -1181,7 +1182,7 @@
         </w:tc>
         <w:tc>
           <w:tcPr>
-            <w:tcW w:type="dxa" w:w="1128"/>
+            <w:tcW w:type="dxa" w:w="720"/>
           </w:tcPr>
           <w:p>
             <w:r/>
@@ -1196,7 +1197,7 @@
         </w:tc>
         <w:tc>
           <w:tcPr>
-            <w:tcW w:type="dxa" w:w="1128"/>
+            <w:tcW w:type="dxa" w:w="1656"/>
           </w:tcPr>
           <w:p>
             <w:r/>
@@ -1211,7 +1212,7 @@
         </w:tc>
         <w:tc>
           <w:tcPr>
-            <w:tcW w:type="dxa" w:w="1128"/>
+            <w:tcW w:type="dxa" w:w="1440"/>
           </w:tcPr>
           <w:p>
             <w:r/>
@@ -1226,7 +1227,7 @@
         </w:tc>
         <w:tc>
           <w:tcPr>
-            <w:tcW w:type="dxa" w:w="1128"/>
+            <w:tcW w:type="dxa" w:w="864"/>
           </w:tcPr>
           <w:p>
             <w:r/>
@@ -1241,7 +1242,7 @@
         </w:tc>
         <w:tc>
           <w:tcPr>
-            <w:tcW w:type="dxa" w:w="1128"/>
+            <w:tcW w:type="dxa" w:w="1512"/>
           </w:tcPr>
           <w:p>
             <w:r/>
@@ -1256,7 +1257,7 @@
         </w:tc>
         <w:tc>
           <w:tcPr>
-            <w:tcW w:type="dxa" w:w="1128"/>
+            <w:tcW w:type="dxa" w:w="1512"/>
           </w:tcPr>
           <w:p>
             <w:r/>
@@ -1273,7 +1274,7 @@
       <w:tr>
         <w:tc>
           <w:tcPr>
-            <w:tcW w:type="dxa" w:w="1128"/>
+            <w:tcW w:type="dxa" w:w="1080"/>
           </w:tcPr>
           <w:p>
             <w:r/>
@@ -1288,7 +1289,7 @@
         </w:tc>
         <w:tc>
           <w:tcPr>
-            <w:tcW w:type="dxa" w:w="1128"/>
+            <w:tcW w:type="dxa" w:w="1008"/>
           </w:tcPr>
           <w:p>
             <w:r/>
@@ -1303,7 +1304,7 @@
         </w:tc>
         <w:tc>
           <w:tcPr>
-            <w:tcW w:type="dxa" w:w="1128"/>
+            <w:tcW w:type="dxa" w:w="720"/>
           </w:tcPr>
           <w:p>
             <w:r/>
@@ -1318,7 +1319,7 @@
         </w:tc>
         <w:tc>
           <w:tcPr>
-            <w:tcW w:type="dxa" w:w="1128"/>
+            <w:tcW w:type="dxa" w:w="1656"/>
           </w:tcPr>
           <w:p>
             <w:r/>
@@ -1333,7 +1334,7 @@
         </w:tc>
         <w:tc>
           <w:tcPr>
-            <w:tcW w:type="dxa" w:w="1128"/>
+            <w:tcW w:type="dxa" w:w="1440"/>
           </w:tcPr>
           <w:p>
             <w:r/>
@@ -1348,7 +1349,7 @@
         </w:tc>
         <w:tc>
           <w:tcPr>
-            <w:tcW w:type="dxa" w:w="1128"/>
+            <w:tcW w:type="dxa" w:w="864"/>
           </w:tcPr>
           <w:p>
             <w:r/>
@@ -1363,7 +1364,7 @@
         </w:tc>
         <w:tc>
           <w:tcPr>
-            <w:tcW w:type="dxa" w:w="1128"/>
+            <w:tcW w:type="dxa" w:w="1512"/>
           </w:tcPr>
           <w:p>
             <w:r/>
@@ -1378,7 +1379,7 @@
         </w:tc>
         <w:tc>
           <w:tcPr>
-            <w:tcW w:type="dxa" w:w="1128"/>
+            <w:tcW w:type="dxa" w:w="1512"/>
           </w:tcPr>
           <w:p>
             <w:r/>
@@ -1395,7 +1396,7 @@
       <w:tr>
         <w:tc>
           <w:tcPr>
-            <w:tcW w:type="dxa" w:w="1128"/>
+            <w:tcW w:type="dxa" w:w="1080"/>
           </w:tcPr>
           <w:p>
             <w:r/>
@@ -1410,7 +1411,7 @@
         </w:tc>
         <w:tc>
           <w:tcPr>
-            <w:tcW w:type="dxa" w:w="1128"/>
+            <w:tcW w:type="dxa" w:w="1008"/>
           </w:tcPr>
           <w:p>
             <w:r/>
@@ -1425,7 +1426,7 @@
         </w:tc>
         <w:tc>
           <w:tcPr>
-            <w:tcW w:type="dxa" w:w="1128"/>
+            <w:tcW w:type="dxa" w:w="720"/>
           </w:tcPr>
           <w:p>
             <w:r/>
@@ -1440,7 +1441,7 @@
         </w:tc>
         <w:tc>
           <w:tcPr>
-            <w:tcW w:type="dxa" w:w="1128"/>
+            <w:tcW w:type="dxa" w:w="1656"/>
           </w:tcPr>
           <w:p>
             <w:r/>
@@ -1455,7 +1456,7 @@
         </w:tc>
         <w:tc>
           <w:tcPr>
-            <w:tcW w:type="dxa" w:w="1128"/>
+            <w:tcW w:type="dxa" w:w="1440"/>
           </w:tcPr>
           <w:p>
             <w:r/>
@@ -1470,7 +1471,7 @@
         </w:tc>
         <w:tc>
           <w:tcPr>
-            <w:tcW w:type="dxa" w:w="1128"/>
+            <w:tcW w:type="dxa" w:w="864"/>
           </w:tcPr>
           <w:p>
             <w:r/>
@@ -1485,7 +1486,7 @@
         </w:tc>
         <w:tc>
           <w:tcPr>
-            <w:tcW w:type="dxa" w:w="1128"/>
+            <w:tcW w:type="dxa" w:w="1512"/>
           </w:tcPr>
           <w:p>
             <w:r/>
@@ -1500,7 +1501,7 @@
         </w:tc>
         <w:tc>
           <w:tcPr>
-            <w:tcW w:type="dxa" w:w="1128"/>
+            <w:tcW w:type="dxa" w:w="1512"/>
           </w:tcPr>
           <w:p>
             <w:r/>
@@ -1517,7 +1518,7 @@
       <w:tr>
         <w:tc>
           <w:tcPr>
-            <w:tcW w:type="dxa" w:w="1128"/>
+            <w:tcW w:type="dxa" w:w="1080"/>
           </w:tcPr>
           <w:p>
             <w:r/>
@@ -1532,7 +1533,7 @@
         </w:tc>
         <w:tc>
           <w:tcPr>
-            <w:tcW w:type="dxa" w:w="1128"/>
+            <w:tcW w:type="dxa" w:w="1008"/>
           </w:tcPr>
           <w:p>
             <w:r/>
@@ -1547,7 +1548,7 @@
         </w:tc>
         <w:tc>
           <w:tcPr>
-            <w:tcW w:type="dxa" w:w="1128"/>
+            <w:tcW w:type="dxa" w:w="720"/>
           </w:tcPr>
           <w:p>
             <w:r/>
@@ -1562,7 +1563,7 @@
         </w:tc>
         <w:tc>
           <w:tcPr>
-            <w:tcW w:type="dxa" w:w="1128"/>
+            <w:tcW w:type="dxa" w:w="1656"/>
           </w:tcPr>
           <w:p>
             <w:r/>
@@ -1577,7 +1578,7 @@
         </w:tc>
         <w:tc>
           <w:tcPr>
-            <w:tcW w:type="dxa" w:w="1128"/>
+            <w:tcW w:type="dxa" w:w="1440"/>
           </w:tcPr>
           <w:p>
             <w:r/>
@@ -1592,7 +1593,7 @@
         </w:tc>
         <w:tc>
           <w:tcPr>
-            <w:tcW w:type="dxa" w:w="1128"/>
+            <w:tcW w:type="dxa" w:w="864"/>
           </w:tcPr>
           <w:p>
             <w:r/>
@@ -1607,7 +1608,7 @@
         </w:tc>
         <w:tc>
           <w:tcPr>
-            <w:tcW w:type="dxa" w:w="1128"/>
+            <w:tcW w:type="dxa" w:w="1512"/>
           </w:tcPr>
           <w:p>
             <w:r/>
@@ -1622,7 +1623,7 @@
         </w:tc>
         <w:tc>
           <w:tcPr>
-            <w:tcW w:type="dxa" w:w="1128"/>
+            <w:tcW w:type="dxa" w:w="1512"/>
           </w:tcPr>
           <w:p>
             <w:r/>
@@ -1639,7 +1640,7 @@
       <w:tr>
         <w:tc>
           <w:tcPr>
-            <w:tcW w:type="dxa" w:w="1128"/>
+            <w:tcW w:type="dxa" w:w="1080"/>
           </w:tcPr>
           <w:p>
             <w:r/>
@@ -1654,7 +1655,7 @@
         </w:tc>
         <w:tc>
           <w:tcPr>
-            <w:tcW w:type="dxa" w:w="1128"/>
+            <w:tcW w:type="dxa" w:w="1008"/>
           </w:tcPr>
           <w:p>
             <w:r/>
@@ -1669,7 +1670,7 @@
         </w:tc>
         <w:tc>
           <w:tcPr>
-            <w:tcW w:type="dxa" w:w="1128"/>
+            <w:tcW w:type="dxa" w:w="720"/>
           </w:tcPr>
           <w:p>
             <w:r/>
@@ -1684,7 +1685,7 @@
         </w:tc>
         <w:tc>
           <w:tcPr>
-            <w:tcW w:type="dxa" w:w="1128"/>
+            <w:tcW w:type="dxa" w:w="1656"/>
           </w:tcPr>
           <w:p>
             <w:r/>
@@ -1699,7 +1700,7 @@
         </w:tc>
         <w:tc>
           <w:tcPr>
-            <w:tcW w:type="dxa" w:w="1128"/>
+            <w:tcW w:type="dxa" w:w="1440"/>
           </w:tcPr>
           <w:p>
             <w:r/>
@@ -1714,7 +1715,7 @@
         </w:tc>
         <w:tc>
           <w:tcPr>
-            <w:tcW w:type="dxa" w:w="1128"/>
+            <w:tcW w:type="dxa" w:w="864"/>
           </w:tcPr>
           <w:p>
             <w:r/>
@@ -1729,7 +1730,7 @@
         </w:tc>
         <w:tc>
           <w:tcPr>
-            <w:tcW w:type="dxa" w:w="1128"/>
+            <w:tcW w:type="dxa" w:w="1512"/>
           </w:tcPr>
           <w:p>
             <w:r/>
@@ -1744,7 +1745,7 @@
         </w:tc>
         <w:tc>
           <w:tcPr>
-            <w:tcW w:type="dxa" w:w="1128"/>
+            <w:tcW w:type="dxa" w:w="1512"/>
           </w:tcPr>
           <w:p>
             <w:r/>
@@ -1761,7 +1762,7 @@
       <w:tr>
         <w:tc>
           <w:tcPr>
-            <w:tcW w:type="dxa" w:w="1128"/>
+            <w:tcW w:type="dxa" w:w="1080"/>
           </w:tcPr>
           <w:p>
             <w:r/>
@@ -1776,7 +1777,7 @@
         </w:tc>
         <w:tc>
           <w:tcPr>
-            <w:tcW w:type="dxa" w:w="1128"/>
+            <w:tcW w:type="dxa" w:w="1008"/>
           </w:tcPr>
           <w:p>
             <w:r/>
@@ -1791,7 +1792,7 @@
         </w:tc>
         <w:tc>
           <w:tcPr>
-            <w:tcW w:type="dxa" w:w="1128"/>
+            <w:tcW w:type="dxa" w:w="720"/>
           </w:tcPr>
           <w:p>
             <w:r/>
@@ -1806,7 +1807,7 @@
         </w:tc>
         <w:tc>
           <w:tcPr>
-            <w:tcW w:type="dxa" w:w="1128"/>
+            <w:tcW w:type="dxa" w:w="1656"/>
           </w:tcPr>
           <w:p>
             <w:r/>
@@ -1821,7 +1822,7 @@
         </w:tc>
         <w:tc>
           <w:tcPr>
-            <w:tcW w:type="dxa" w:w="1128"/>
+            <w:tcW w:type="dxa" w:w="1440"/>
           </w:tcPr>
           <w:p>
             <w:r/>
@@ -1836,7 +1837,7 @@
         </w:tc>
         <w:tc>
           <w:tcPr>
-            <w:tcW w:type="dxa" w:w="1128"/>
+            <w:tcW w:type="dxa" w:w="864"/>
           </w:tcPr>
           <w:p>
             <w:r/>
@@ -1851,7 +1852,7 @@
         </w:tc>
         <w:tc>
           <w:tcPr>
-            <w:tcW w:type="dxa" w:w="1128"/>
+            <w:tcW w:type="dxa" w:w="1512"/>
           </w:tcPr>
           <w:p>
             <w:r/>
@@ -1866,7 +1867,7 @@
         </w:tc>
         <w:tc>
           <w:tcPr>
-            <w:tcW w:type="dxa" w:w="1128"/>
+            <w:tcW w:type="dxa" w:w="1512"/>
           </w:tcPr>
           <w:p>
             <w:r/>
@@ -1883,7 +1884,7 @@
       <w:tr>
         <w:tc>
           <w:tcPr>
-            <w:tcW w:type="dxa" w:w="1128"/>
+            <w:tcW w:type="dxa" w:w="1080"/>
           </w:tcPr>
           <w:p>
             <w:r/>
@@ -1898,7 +1899,7 @@
         </w:tc>
         <w:tc>
           <w:tcPr>
-            <w:tcW w:type="dxa" w:w="1128"/>
+            <w:tcW w:type="dxa" w:w="1008"/>
           </w:tcPr>
           <w:p>
             <w:r/>
@@ -1913,7 +1914,7 @@
         </w:tc>
         <w:tc>
           <w:tcPr>
-            <w:tcW w:type="dxa" w:w="1128"/>
+            <w:tcW w:type="dxa" w:w="720"/>
           </w:tcPr>
           <w:p>
             <w:r/>
@@ -1928,7 +1929,7 @@
         </w:tc>
         <w:tc>
           <w:tcPr>
-            <w:tcW w:type="dxa" w:w="1128"/>
+            <w:tcW w:type="dxa" w:w="1656"/>
           </w:tcPr>
           <w:p>
             <w:r/>
@@ -1943,7 +1944,7 @@
         </w:tc>
         <w:tc>
           <w:tcPr>
-            <w:tcW w:type="dxa" w:w="1128"/>
+            <w:tcW w:type="dxa" w:w="1440"/>
           </w:tcPr>
           <w:p>
             <w:r/>
@@ -1958,7 +1959,7 @@
         </w:tc>
         <w:tc>
           <w:tcPr>
-            <w:tcW w:type="dxa" w:w="1128"/>
+            <w:tcW w:type="dxa" w:w="864"/>
           </w:tcPr>
           <w:p>
             <w:r/>
@@ -1973,7 +1974,7 @@
         </w:tc>
         <w:tc>
           <w:tcPr>
-            <w:tcW w:type="dxa" w:w="1128"/>
+            <w:tcW w:type="dxa" w:w="1512"/>
           </w:tcPr>
           <w:p>
             <w:r/>
@@ -1988,7 +1989,7 @@
         </w:tc>
         <w:tc>
           <w:tcPr>
-            <w:tcW w:type="dxa" w:w="1128"/>
+            <w:tcW w:type="dxa" w:w="1512"/>
           </w:tcPr>
           <w:p>
             <w:r/>
@@ -2005,7 +2006,7 @@
       <w:tr>
         <w:tc>
           <w:tcPr>
-            <w:tcW w:type="dxa" w:w="1128"/>
+            <w:tcW w:type="dxa" w:w="1080"/>
           </w:tcPr>
           <w:p>
             <w:r/>
@@ -2020,7 +2021,7 @@
         </w:tc>
         <w:tc>
           <w:tcPr>
-            <w:tcW w:type="dxa" w:w="1128"/>
+            <w:tcW w:type="dxa" w:w="1008"/>
           </w:tcPr>
           <w:p>
             <w:r/>
@@ -2035,7 +2036,7 @@
         </w:tc>
         <w:tc>
           <w:tcPr>
-            <w:tcW w:type="dxa" w:w="1128"/>
+            <w:tcW w:type="dxa" w:w="720"/>
           </w:tcPr>
           <w:p>
             <w:r/>
@@ -2050,7 +2051,7 @@
         </w:tc>
         <w:tc>
           <w:tcPr>
-            <w:tcW w:type="dxa" w:w="1128"/>
+            <w:tcW w:type="dxa" w:w="1656"/>
           </w:tcPr>
           <w:p>
             <w:r/>
@@ -2065,7 +2066,7 @@
         </w:tc>
         <w:tc>
           <w:tcPr>
-            <w:tcW w:type="dxa" w:w="1128"/>
+            <w:tcW w:type="dxa" w:w="1440"/>
           </w:tcPr>
           <w:p>
             <w:r/>
@@ -2080,7 +2081,7 @@
         </w:tc>
         <w:tc>
           <w:tcPr>
-            <w:tcW w:type="dxa" w:w="1128"/>
+            <w:tcW w:type="dxa" w:w="864"/>
           </w:tcPr>
           <w:p>
             <w:r/>
@@ -2095,7 +2096,7 @@
         </w:tc>
         <w:tc>
           <w:tcPr>
-            <w:tcW w:type="dxa" w:w="1128"/>
+            <w:tcW w:type="dxa" w:w="1512"/>
           </w:tcPr>
           <w:p>
             <w:r/>
@@ -2110,7 +2111,7 @@
         </w:tc>
         <w:tc>
           <w:tcPr>
-            <w:tcW w:type="dxa" w:w="1128"/>
+            <w:tcW w:type="dxa" w:w="1512"/>
           </w:tcPr>
           <w:p>
             <w:r/>
@@ -2127,7 +2128,7 @@
       <w:tr>
         <w:tc>
           <w:tcPr>
-            <w:tcW w:type="dxa" w:w="1128"/>
+            <w:tcW w:type="dxa" w:w="1080"/>
           </w:tcPr>
           <w:p>
             <w:r/>
@@ -2142,7 +2143,7 @@
         </w:tc>
         <w:tc>
           <w:tcPr>
-            <w:tcW w:type="dxa" w:w="1128"/>
+            <w:tcW w:type="dxa" w:w="1008"/>
           </w:tcPr>
           <w:p>
             <w:r/>
@@ -2157,7 +2158,7 @@
         </w:tc>
         <w:tc>
           <w:tcPr>
-            <w:tcW w:type="dxa" w:w="1128"/>
+            <w:tcW w:type="dxa" w:w="720"/>
           </w:tcPr>
           <w:p>
             <w:r/>
@@ -2172,7 +2173,7 @@
         </w:tc>
         <w:tc>
           <w:tcPr>
-            <w:tcW w:type="dxa" w:w="1128"/>
+            <w:tcW w:type="dxa" w:w="1656"/>
           </w:tcPr>
           <w:p>
             <w:r/>
@@ -2187,7 +2188,7 @@
         </w:tc>
         <w:tc>
           <w:tcPr>
-            <w:tcW w:type="dxa" w:w="1128"/>
+            <w:tcW w:type="dxa" w:w="1440"/>
           </w:tcPr>
           <w:p>
             <w:r/>
@@ -2202,7 +2203,7 @@
         </w:tc>
         <w:tc>
           <w:tcPr>
-            <w:tcW w:type="dxa" w:w="1128"/>
+            <w:tcW w:type="dxa" w:w="864"/>
           </w:tcPr>
           <w:p>
             <w:r/>
@@ -2217,7 +2218,7 @@
         </w:tc>
         <w:tc>
           <w:tcPr>
-            <w:tcW w:type="dxa" w:w="1128"/>
+            <w:tcW w:type="dxa" w:w="1512"/>
           </w:tcPr>
           <w:p>
             <w:r/>
@@ -2232,7 +2233,7 @@
         </w:tc>
         <w:tc>
           <w:tcPr>
-            <w:tcW w:type="dxa" w:w="1128"/>
+            <w:tcW w:type="dxa" w:w="1512"/>
           </w:tcPr>
           <w:p>
             <w:r/>
@@ -2249,7 +2250,7 @@
       <w:tr>
         <w:tc>
           <w:tcPr>
-            <w:tcW w:type="dxa" w:w="1128"/>
+            <w:tcW w:type="dxa" w:w="1080"/>
           </w:tcPr>
           <w:p>
             <w:r/>
@@ -2264,7 +2265,7 @@
         </w:tc>
         <w:tc>
           <w:tcPr>
-            <w:tcW w:type="dxa" w:w="1128"/>
+            <w:tcW w:type="dxa" w:w="1008"/>
           </w:tcPr>
           <w:p>
             <w:r/>
@@ -2279,7 +2280,7 @@
         </w:tc>
         <w:tc>
           <w:tcPr>
-            <w:tcW w:type="dxa" w:w="1128"/>
+            <w:tcW w:type="dxa" w:w="720"/>
           </w:tcPr>
           <w:p>
             <w:r/>
@@ -2294,7 +2295,7 @@
         </w:tc>
         <w:tc>
           <w:tcPr>
-            <w:tcW w:type="dxa" w:w="1128"/>
+            <w:tcW w:type="dxa" w:w="1656"/>
           </w:tcPr>
           <w:p>
             <w:r/>
@@ -2309,7 +2310,7 @@
         </w:tc>
         <w:tc>
           <w:tcPr>
-            <w:tcW w:type="dxa" w:w="1128"/>
+            <w:tcW w:type="dxa" w:w="1440"/>
           </w:tcPr>
           <w:p>
             <w:r/>
@@ -2324,7 +2325,7 @@
         </w:tc>
         <w:tc>
           <w:tcPr>
-            <w:tcW w:type="dxa" w:w="1128"/>
+            <w:tcW w:type="dxa" w:w="864"/>
           </w:tcPr>
           <w:p>
             <w:r/>
@@ -2339,7 +2340,7 @@
         </w:tc>
         <w:tc>
           <w:tcPr>
-            <w:tcW w:type="dxa" w:w="1128"/>
+            <w:tcW w:type="dxa" w:w="1512"/>
           </w:tcPr>
           <w:p>
             <w:r/>
@@ -2354,7 +2355,7 @@
         </w:tc>
         <w:tc>
           <w:tcPr>
-            <w:tcW w:type="dxa" w:w="1128"/>
+            <w:tcW w:type="dxa" w:w="1512"/>
           </w:tcPr>
           <w:p>
             <w:r/>
@@ -2371,7 +2372,7 @@
       <w:tr>
         <w:tc>
           <w:tcPr>
-            <w:tcW w:type="dxa" w:w="1128"/>
+            <w:tcW w:type="dxa" w:w="1080"/>
           </w:tcPr>
           <w:p>
             <w:r/>
@@ -2386,7 +2387,7 @@
         </w:tc>
         <w:tc>
           <w:tcPr>
-            <w:tcW w:type="dxa" w:w="1128"/>
+            <w:tcW w:type="dxa" w:w="1008"/>
           </w:tcPr>
           <w:p>
             <w:r/>
@@ -2401,7 +2402,7 @@
         </w:tc>
         <w:tc>
           <w:tcPr>
-            <w:tcW w:type="dxa" w:w="1128"/>
+            <w:tcW w:type="dxa" w:w="720"/>
           </w:tcPr>
           <w:p>
             <w:r/>
@@ -2416,7 +2417,7 @@
         </w:tc>
         <w:tc>
           <w:tcPr>
-            <w:tcW w:type="dxa" w:w="1128"/>
+            <w:tcW w:type="dxa" w:w="1656"/>
           </w:tcPr>
           <w:p>
             <w:r/>
@@ -2431,7 +2432,7 @@
         </w:tc>
         <w:tc>
           <w:tcPr>
-            <w:tcW w:type="dxa" w:w="1128"/>
+            <w:tcW w:type="dxa" w:w="1440"/>
           </w:tcPr>
           <w:p>
             <w:r/>
@@ -2446,7 +2447,7 @@
         </w:tc>
         <w:tc>
           <w:tcPr>
-            <w:tcW w:type="dxa" w:w="1128"/>
+            <w:tcW w:type="dxa" w:w="864"/>
           </w:tcPr>
           <w:p>
             <w:r/>
@@ -2461,7 +2462,7 @@
         </w:tc>
         <w:tc>
           <w:tcPr>
-            <w:tcW w:type="dxa" w:w="1128"/>
+            <w:tcW w:type="dxa" w:w="1512"/>
           </w:tcPr>
           <w:p>
             <w:r/>
@@ -2476,7 +2477,7 @@
         </w:tc>
         <w:tc>
           <w:tcPr>
-            <w:tcW w:type="dxa" w:w="1128"/>
+            <w:tcW w:type="dxa" w:w="1512"/>
           </w:tcPr>
           <w:p>
             <w:r/>

</xml_diff>

<commit_message>
Docx builder: fixed table layout
Co-Authored-By: Claude Fable 5.1 <noreply@anthropic.com>
Claude-Session: https://claude.ai/code/session_01A1WQ3WGcJw8tT3QK2n57xo
</commit_message>
<xml_diff>
--- a/manuscript/unityEQE_en_v2.docx
+++ b/manuscript/unityEQE_en_v2.docx
@@ -894,28 +894,29 @@
         <w:tblW w:type="auto" w:w="0"/>
         <w:tblLayout w:type="fixed"/>
         <w:tblLook w:firstColumn="1" w:firstRow="1" w:lastColumn="0" w:lastRow="0" w:noHBand="0" w:noVBand="1" w:val="04A0"/>
+        <w:tblLayout w:type="fixed"/>
       </w:tblPr>
       <w:tblGrid>
-        <w:gridCol w:w="1128"/>
-        <w:gridCol w:w="1128"/>
-        <w:gridCol w:w="1128"/>
-        <w:gridCol w:w="1128"/>
-        <w:gridCol w:w="1128"/>
-        <w:gridCol w:w="1128"/>
-        <w:gridCol w:w="1128"/>
-        <w:gridCol w:w="1128"/>
+        <w:gridCol w:w="893"/>
+        <w:gridCol w:w="835"/>
+        <w:gridCol w:w="605"/>
+        <w:gridCol w:w="1469"/>
+        <w:gridCol w:w="1296"/>
+        <w:gridCol w:w="720"/>
+        <w:gridCol w:w="1440"/>
+        <w:gridCol w:w="1440"/>
       </w:tblGrid>
       <w:tr>
         <w:tc>
           <w:tcPr>
-            <w:tcW w:type="dxa" w:w="1080"/>
+            <w:tcW w:type="dxa" w:w="893"/>
           </w:tcPr>
           <w:p>
             <w:r/>
             <w:r>
               <w:rPr>
                 <w:b/>
-                <w:sz w:val="16"/>
+                <w:sz w:val="15"/>
               </w:rPr>
               <w:t>d_ETL (nm)</w:t>
             </w:r>
@@ -923,14 +924,14 @@
         </w:tc>
         <w:tc>
           <w:tcPr>
-            <w:tcW w:type="dxa" w:w="1008"/>
+            <w:tcW w:type="dxa" w:w="835"/>
           </w:tcPr>
           <w:p>
             <w:r/>
             <w:r>
               <w:rPr>
                 <w:b/>
-                <w:sz w:val="16"/>
+                <w:sz w:val="15"/>
               </w:rPr>
               <w:t>k_ITO</w:t>
             </w:r>
@@ -938,6 +939,51 @@
         </w:tc>
         <w:tc>
           <w:tcPr>
+            <w:tcW w:type="dxa" w:w="605"/>
+          </w:tcPr>
+          <w:p>
+            <w:r/>
+            <w:r>
+              <w:rPr>
+                <w:b/>
+                <w:sz w:val="15"/>
+              </w:rPr>
+              <w:t>Θ</w:t>
+            </w:r>
+          </w:p>
+        </w:tc>
+        <w:tc>
+          <w:tcPr>
+            <w:tcW w:type="dxa" w:w="1469"/>
+          </w:tcPr>
+          <w:p>
+            <w:r/>
+            <w:r>
+              <w:rPr>
+                <w:b/>
+                <w:sz w:val="15"/>
+              </w:rPr>
+              <w:t>η_sub (full / 550 nm)</w:t>
+            </w:r>
+          </w:p>
+        </w:tc>
+        <w:tc>
+          <w:tcPr>
+            <w:tcW w:type="dxa" w:w="1296"/>
+          </w:tcPr>
+          <w:p>
+            <w:r/>
+            <w:r>
+              <w:rPr>
+                <w:b/>
+                <w:sz w:val="15"/>
+              </w:rPr>
+              <w:t>SPP loss</w:t>
+            </w:r>
+          </w:p>
+        </w:tc>
+        <w:tc>
+          <w:tcPr>
             <w:tcW w:type="dxa" w:w="720"/>
           </w:tcPr>
           <w:p>
@@ -945,24 +991,24 @@
             <w:r>
               <w:rPr>
                 <w:b/>
-                <w:sz w:val="16"/>
-              </w:rPr>
-              <w:t>Θ</w:t>
-            </w:r>
-          </w:p>
-        </w:tc>
-        <w:tc>
-          <w:tcPr>
-            <w:tcW w:type="dxa" w:w="1656"/>
+                <w:sz w:val="15"/>
+              </w:rPr>
+              <w:t>A′</w:t>
+            </w:r>
+          </w:p>
+        </w:tc>
+        <w:tc>
+          <w:tcPr>
+            <w:tcW w:type="dxa" w:w="1440"/>
           </w:tcPr>
           <w:p>
             <w:r/>
             <w:r>
               <w:rPr>
                 <w:b/>
-                <w:sz w:val="16"/>
-              </w:rPr>
-              <w:t>η_sub (full / 550 nm)</w:t>
+                <w:sz w:val="15"/>
+              </w:rPr>
+              <w:t>η_ext</w:t>
             </w:r>
           </w:p>
         </w:tc>
@@ -975,52 +1021,7 @@
             <w:r>
               <w:rPr>
                 <w:b/>
-                <w:sz w:val="16"/>
-              </w:rPr>
-              <w:t>SPP loss</w:t>
-            </w:r>
-          </w:p>
-        </w:tc>
-        <w:tc>
-          <w:tcPr>
-            <w:tcW w:type="dxa" w:w="864"/>
-          </w:tcPr>
-          <w:p>
-            <w:r/>
-            <w:r>
-              <w:rPr>
-                <w:b/>
-                <w:sz w:val="16"/>
-              </w:rPr>
-              <w:t>A′</w:t>
-            </w:r>
-          </w:p>
-        </w:tc>
-        <w:tc>
-          <w:tcPr>
-            <w:tcW w:type="dxa" w:w="1512"/>
-          </w:tcPr>
-          <w:p>
-            <w:r/>
-            <w:r>
-              <w:rPr>
-                <w:b/>
-                <w:sz w:val="16"/>
-              </w:rPr>
-              <w:t>η_ext</w:t>
-            </w:r>
-          </w:p>
-        </w:tc>
-        <w:tc>
-          <w:tcPr>
-            <w:tcW w:type="dxa" w:w="1512"/>
-          </w:tcPr>
-          <w:p>
-            <w:r/>
-            <w:r>
-              <w:rPr>
-                <w:b/>
-                <w:sz w:val="16"/>
+                <w:sz w:val="15"/>
               </w:rPr>
               <w:t>EQE</w:t>
             </w:r>
@@ -1030,14 +1031,14 @@
       <w:tr>
         <w:tc>
           <w:tcPr>
-            <w:tcW w:type="dxa" w:w="1080"/>
-          </w:tcPr>
-          <w:p>
-            <w:r/>
-            <w:r>
-              <w:rPr>
-                <w:b w:val="0"/>
-                <w:sz w:val="16"/>
+            <w:tcW w:type="dxa" w:w="893"/>
+          </w:tcPr>
+          <w:p>
+            <w:r/>
+            <w:r>
+              <w:rPr>
+                <w:b w:val="0"/>
+                <w:sz w:val="15"/>
               </w:rPr>
               <w:t>200</w:t>
             </w:r>
@@ -1045,14 +1046,14 @@
         </w:tc>
         <w:tc>
           <w:tcPr>
-            <w:tcW w:type="dxa" w:w="1008"/>
-          </w:tcPr>
-          <w:p>
-            <w:r/>
-            <w:r>
-              <w:rPr>
-                <w:b w:val="0"/>
-                <w:sz w:val="16"/>
+            <w:tcW w:type="dxa" w:w="835"/>
+          </w:tcPr>
+          <w:p>
+            <w:r/>
+            <w:r>
+              <w:rPr>
+                <w:b w:val="0"/>
+                <w:sz w:val="15"/>
               </w:rPr>
               <w:t>0.0032</w:t>
             </w:r>
@@ -1060,6 +1061,51 @@
         </w:tc>
         <w:tc>
           <w:tcPr>
+            <w:tcW w:type="dxa" w:w="605"/>
+          </w:tcPr>
+          <w:p>
+            <w:r/>
+            <w:r>
+              <w:rPr>
+                <w:b w:val="0"/>
+                <w:sz w:val="15"/>
+              </w:rPr>
+              <w:t>0.67</w:t>
+            </w:r>
+          </w:p>
+        </w:tc>
+        <w:tc>
+          <w:tcPr>
+            <w:tcW w:type="dxa" w:w="1469"/>
+          </w:tcPr>
+          <w:p>
+            <w:r/>
+            <w:r>
+              <w:rPr>
+                <w:b w:val="0"/>
+                <w:sz w:val="15"/>
+              </w:rPr>
+              <w:t>0.962 / 0.963</w:t>
+            </w:r>
+          </w:p>
+        </w:tc>
+        <w:tc>
+          <w:tcPr>
+            <w:tcW w:type="dxa" w:w="1296"/>
+          </w:tcPr>
+          <w:p>
+            <w:r/>
+            <w:r>
+              <w:rPr>
+                <w:b w:val="0"/>
+                <w:sz w:val="15"/>
+              </w:rPr>
+              <w:t>0.023 / 0.023</w:t>
+            </w:r>
+          </w:p>
+        </w:tc>
+        <w:tc>
+          <w:tcPr>
             <w:tcW w:type="dxa" w:w="720"/>
           </w:tcPr>
           <w:p>
@@ -1067,24 +1113,9 @@
             <w:r>
               <w:rPr>
                 <w:b w:val="0"/>
-                <w:sz w:val="16"/>
-              </w:rPr>
-              <w:t>0.67</w:t>
-            </w:r>
-          </w:p>
-        </w:tc>
-        <w:tc>
-          <w:tcPr>
-            <w:tcW w:type="dxa" w:w="1656"/>
-          </w:tcPr>
-          <w:p>
-            <w:r/>
-            <w:r>
-              <w:rPr>
-                <w:b w:val="0"/>
-                <w:sz w:val="16"/>
-              </w:rPr>
-              <w:t>0.962 / 0.963</w:t>
+                <w:sz w:val="15"/>
+              </w:rPr>
+              <w:t>0.029</w:t>
             </w:r>
           </w:p>
         </w:tc>
@@ -1097,37 +1128,7 @@
             <w:r>
               <w:rPr>
                 <w:b w:val="0"/>
-                <w:sz w:val="16"/>
-              </w:rPr>
-              <w:t>0.023 / 0.023</w:t>
-            </w:r>
-          </w:p>
-        </w:tc>
-        <w:tc>
-          <w:tcPr>
-            <w:tcW w:type="dxa" w:w="864"/>
-          </w:tcPr>
-          <w:p>
-            <w:r/>
-            <w:r>
-              <w:rPr>
-                <w:b w:val="0"/>
-                <w:sz w:val="16"/>
-              </w:rPr>
-              <w:t>0.029</w:t>
-            </w:r>
-          </w:p>
-        </w:tc>
-        <w:tc>
-          <w:tcPr>
-            <w:tcW w:type="dxa" w:w="1512"/>
-          </w:tcPr>
-          <w:p>
-            <w:r/>
-            <w:r>
-              <w:rPr>
-                <w:b w:val="0"/>
-                <w:sz w:val="16"/>
+                <w:sz w:val="15"/>
               </w:rPr>
               <w:t>0.904 / 0.912</w:t>
             </w:r>
@@ -1135,14 +1136,14 @@
         </w:tc>
         <w:tc>
           <w:tcPr>
-            <w:tcW w:type="dxa" w:w="1512"/>
-          </w:tcPr>
-          <w:p>
-            <w:r/>
-            <w:r>
-              <w:rPr>
-                <w:b w:val="0"/>
-                <w:sz w:val="16"/>
+            <w:tcW w:type="dxa" w:w="1440"/>
+          </w:tcPr>
+          <w:p>
+            <w:r/>
+            <w:r>
+              <w:rPr>
+                <w:b w:val="0"/>
+                <w:sz w:val="15"/>
               </w:rPr>
               <w:t>0.870 / 0.878</w:t>
             </w:r>
@@ -1152,14 +1153,14 @@
       <w:tr>
         <w:tc>
           <w:tcPr>
-            <w:tcW w:type="dxa" w:w="1080"/>
-          </w:tcPr>
-          <w:p>
-            <w:r/>
-            <w:r>
-              <w:rPr>
-                <w:b w:val="0"/>
-                <w:sz w:val="16"/>
+            <w:tcW w:type="dxa" w:w="893"/>
+          </w:tcPr>
+          <w:p>
+            <w:r/>
+            <w:r>
+              <w:rPr>
+                <w:b w:val="0"/>
+                <w:sz w:val="15"/>
               </w:rPr>
               <w:t>200</w:t>
             </w:r>
@@ -1167,14 +1168,14 @@
         </w:tc>
         <w:tc>
           <w:tcPr>
-            <w:tcW w:type="dxa" w:w="1008"/>
-          </w:tcPr>
-          <w:p>
-            <w:r/>
-            <w:r>
-              <w:rPr>
-                <w:b w:val="0"/>
-                <w:sz w:val="16"/>
+            <w:tcW w:type="dxa" w:w="835"/>
+          </w:tcPr>
+          <w:p>
+            <w:r/>
+            <w:r>
+              <w:rPr>
+                <w:b w:val="0"/>
+                <w:sz w:val="15"/>
               </w:rPr>
               <w:t>0.0032</w:t>
             </w:r>
@@ -1182,6 +1183,51 @@
         </w:tc>
         <w:tc>
           <w:tcPr>
+            <w:tcW w:type="dxa" w:w="605"/>
+          </w:tcPr>
+          <w:p>
+            <w:r/>
+            <w:r>
+              <w:rPr>
+                <w:b w:val="0"/>
+                <w:sz w:val="15"/>
+              </w:rPr>
+              <w:t>0.80</w:t>
+            </w:r>
+          </w:p>
+        </w:tc>
+        <w:tc>
+          <w:tcPr>
+            <w:tcW w:type="dxa" w:w="1469"/>
+          </w:tcPr>
+          <w:p>
+            <w:r/>
+            <w:r>
+              <w:rPr>
+                <w:b w:val="0"/>
+                <w:sz w:val="15"/>
+              </w:rPr>
+              <w:t>0.970 / 0.971</w:t>
+            </w:r>
+          </w:p>
+        </w:tc>
+        <w:tc>
+          <w:tcPr>
+            <w:tcW w:type="dxa" w:w="1296"/>
+          </w:tcPr>
+          <w:p>
+            <w:r/>
+            <w:r>
+              <w:rPr>
+                <w:b w:val="0"/>
+                <w:sz w:val="15"/>
+              </w:rPr>
+              <w:t>0.015 / 0.015</w:t>
+            </w:r>
+          </w:p>
+        </w:tc>
+        <w:tc>
+          <w:tcPr>
             <w:tcW w:type="dxa" w:w="720"/>
           </w:tcPr>
           <w:p>
@@ -1189,24 +1235,9 @@
             <w:r>
               <w:rPr>
                 <w:b w:val="0"/>
-                <w:sz w:val="16"/>
-              </w:rPr>
-              <w:t>0.80</w:t>
-            </w:r>
-          </w:p>
-        </w:tc>
-        <w:tc>
-          <w:tcPr>
-            <w:tcW w:type="dxa" w:w="1656"/>
-          </w:tcPr>
-          <w:p>
-            <w:r/>
-            <w:r>
-              <w:rPr>
-                <w:b w:val="0"/>
-                <w:sz w:val="16"/>
-              </w:rPr>
-              <w:t>0.970 / 0.971</w:t>
+                <w:sz w:val="15"/>
+              </w:rPr>
+              <w:t>0.029</w:t>
             </w:r>
           </w:p>
         </w:tc>
@@ -1219,37 +1250,7 @@
             <w:r>
               <w:rPr>
                 <w:b w:val="0"/>
-                <w:sz w:val="16"/>
-              </w:rPr>
-              <w:t>0.015 / 0.015</w:t>
-            </w:r>
-          </w:p>
-        </w:tc>
-        <w:tc>
-          <w:tcPr>
-            <w:tcW w:type="dxa" w:w="864"/>
-          </w:tcPr>
-          <w:p>
-            <w:r/>
-            <w:r>
-              <w:rPr>
-                <w:b w:val="0"/>
-                <w:sz w:val="16"/>
-              </w:rPr>
-              <w:t>0.029</w:t>
-            </w:r>
-          </w:p>
-        </w:tc>
-        <w:tc>
-          <w:tcPr>
-            <w:tcW w:type="dxa" w:w="1512"/>
-          </w:tcPr>
-          <w:p>
-            <w:r/>
-            <w:r>
-              <w:rPr>
-                <w:b w:val="0"/>
-                <w:sz w:val="16"/>
+                <w:sz w:val="15"/>
               </w:rPr>
               <w:t>0.900 / 0.908</w:t>
             </w:r>
@@ -1257,14 +1258,14 @@
         </w:tc>
         <w:tc>
           <w:tcPr>
-            <w:tcW w:type="dxa" w:w="1512"/>
-          </w:tcPr>
-          <w:p>
-            <w:r/>
-            <w:r>
-              <w:rPr>
-                <w:b w:val="0"/>
-                <w:sz w:val="16"/>
+            <w:tcW w:type="dxa" w:w="1440"/>
+          </w:tcPr>
+          <w:p>
+            <w:r/>
+            <w:r>
+              <w:rPr>
+                <w:b w:val="0"/>
+                <w:sz w:val="15"/>
               </w:rPr>
               <w:t>0.873 / 0.882</w:t>
             </w:r>
@@ -1274,14 +1275,14 @@
       <w:tr>
         <w:tc>
           <w:tcPr>
-            <w:tcW w:type="dxa" w:w="1080"/>
-          </w:tcPr>
-          <w:p>
-            <w:r/>
-            <w:r>
-              <w:rPr>
-                <w:b w:val="0"/>
-                <w:sz w:val="16"/>
+            <w:tcW w:type="dxa" w:w="893"/>
+          </w:tcPr>
+          <w:p>
+            <w:r/>
+            <w:r>
+              <w:rPr>
+                <w:b w:val="0"/>
+                <w:sz w:val="15"/>
               </w:rPr>
               <w:t>200</w:t>
             </w:r>
@@ -1289,14 +1290,14 @@
         </w:tc>
         <w:tc>
           <w:tcPr>
-            <w:tcW w:type="dxa" w:w="1008"/>
-          </w:tcPr>
-          <w:p>
-            <w:r/>
-            <w:r>
-              <w:rPr>
-                <w:b w:val="0"/>
-                <w:sz w:val="16"/>
+            <w:tcW w:type="dxa" w:w="835"/>
+          </w:tcPr>
+          <w:p>
+            <w:r/>
+            <w:r>
+              <w:rPr>
+                <w:b w:val="0"/>
+                <w:sz w:val="15"/>
               </w:rPr>
               <w:t>0.0032</w:t>
             </w:r>
@@ -1304,6 +1305,51 @@
         </w:tc>
         <w:tc>
           <w:tcPr>
+            <w:tcW w:type="dxa" w:w="605"/>
+          </w:tcPr>
+          <w:p>
+            <w:r/>
+            <w:r>
+              <w:rPr>
+                <w:b w:val="0"/>
+                <w:sz w:val="15"/>
+              </w:rPr>
+              <w:t>0.90</w:t>
+            </w:r>
+          </w:p>
+        </w:tc>
+        <w:tc>
+          <w:tcPr>
+            <w:tcW w:type="dxa" w:w="1469"/>
+          </w:tcPr>
+          <w:p>
+            <w:r/>
+            <w:r>
+              <w:rPr>
+                <w:b w:val="0"/>
+                <w:sz w:val="15"/>
+              </w:rPr>
+              <w:t>0.975 / 0.976</w:t>
+            </w:r>
+          </w:p>
+        </w:tc>
+        <w:tc>
+          <w:tcPr>
+            <w:tcW w:type="dxa" w:w="1296"/>
+          </w:tcPr>
+          <w:p>
+            <w:r/>
+            <w:r>
+              <w:rPr>
+                <w:b w:val="0"/>
+                <w:sz w:val="15"/>
+              </w:rPr>
+              <w:t>0.010 / 0.010</w:t>
+            </w:r>
+          </w:p>
+        </w:tc>
+        <w:tc>
+          <w:tcPr>
             <w:tcW w:type="dxa" w:w="720"/>
           </w:tcPr>
           <w:p>
@@ -1311,24 +1357,9 @@
             <w:r>
               <w:rPr>
                 <w:b w:val="0"/>
-                <w:sz w:val="16"/>
-              </w:rPr>
-              <w:t>0.90</w:t>
-            </w:r>
-          </w:p>
-        </w:tc>
-        <w:tc>
-          <w:tcPr>
-            <w:tcW w:type="dxa" w:w="1656"/>
-          </w:tcPr>
-          <w:p>
-            <w:r/>
-            <w:r>
-              <w:rPr>
-                <w:b w:val="0"/>
-                <w:sz w:val="16"/>
-              </w:rPr>
-              <w:t>0.975 / 0.976</w:t>
+                <w:sz w:val="15"/>
+              </w:rPr>
+              <w:t>0.029</w:t>
             </w:r>
           </w:p>
         </w:tc>
@@ -1341,37 +1372,7 @@
             <w:r>
               <w:rPr>
                 <w:b w:val="0"/>
-                <w:sz w:val="16"/>
-              </w:rPr>
-              <w:t>0.010 / 0.010</w:t>
-            </w:r>
-          </w:p>
-        </w:tc>
-        <w:tc>
-          <w:tcPr>
-            <w:tcW w:type="dxa" w:w="864"/>
-          </w:tcPr>
-          <w:p>
-            <w:r/>
-            <w:r>
-              <w:rPr>
-                <w:b w:val="0"/>
-                <w:sz w:val="16"/>
-              </w:rPr>
-              <w:t>0.029</w:t>
-            </w:r>
-          </w:p>
-        </w:tc>
-        <w:tc>
-          <w:tcPr>
-            <w:tcW w:type="dxa" w:w="1512"/>
-          </w:tcPr>
-          <w:p>
-            <w:r/>
-            <w:r>
-              <w:rPr>
-                <w:b w:val="0"/>
-                <w:sz w:val="16"/>
+                <w:sz w:val="15"/>
               </w:rPr>
               <w:t>0.897 / 0.906</w:t>
             </w:r>
@@ -1379,14 +1380,14 @@
         </w:tc>
         <w:tc>
           <w:tcPr>
-            <w:tcW w:type="dxa" w:w="1512"/>
-          </w:tcPr>
-          <w:p>
-            <w:r/>
-            <w:r>
-              <w:rPr>
-                <w:b w:val="0"/>
-                <w:sz w:val="16"/>
+            <w:tcW w:type="dxa" w:w="1440"/>
+          </w:tcPr>
+          <w:p>
+            <w:r/>
+            <w:r>
+              <w:rPr>
+                <w:b w:val="0"/>
+                <w:sz w:val="15"/>
               </w:rPr>
               <w:t>0.875 / 0.884</w:t>
             </w:r>
@@ -1396,14 +1397,14 @@
       <w:tr>
         <w:tc>
           <w:tcPr>
-            <w:tcW w:type="dxa" w:w="1080"/>
-          </w:tcPr>
-          <w:p>
-            <w:r/>
-            <w:r>
-              <w:rPr>
-                <w:b w:val="0"/>
-                <w:sz w:val="16"/>
+            <w:tcW w:type="dxa" w:w="893"/>
+          </w:tcPr>
+          <w:p>
+            <w:r/>
+            <w:r>
+              <w:rPr>
+                <w:b w:val="0"/>
+                <w:sz w:val="15"/>
               </w:rPr>
               <w:t>200</w:t>
             </w:r>
@@ -1411,14 +1412,14 @@
         </w:tc>
         <w:tc>
           <w:tcPr>
-            <w:tcW w:type="dxa" w:w="1008"/>
-          </w:tcPr>
-          <w:p>
-            <w:r/>
-            <w:r>
-              <w:rPr>
-                <w:b w:val="0"/>
-                <w:sz w:val="16"/>
+            <w:tcW w:type="dxa" w:w="835"/>
+          </w:tcPr>
+          <w:p>
+            <w:r/>
+            <w:r>
+              <w:rPr>
+                <w:b w:val="0"/>
+                <w:sz w:val="15"/>
               </w:rPr>
               <w:t>0.002</w:t>
             </w:r>
@@ -1426,6 +1427,51 @@
         </w:tc>
         <w:tc>
           <w:tcPr>
+            <w:tcW w:type="dxa" w:w="605"/>
+          </w:tcPr>
+          <w:p>
+            <w:r/>
+            <w:r>
+              <w:rPr>
+                <w:b w:val="0"/>
+                <w:sz w:val="15"/>
+              </w:rPr>
+              <w:t>0.67</w:t>
+            </w:r>
+          </w:p>
+        </w:tc>
+        <w:tc>
+          <w:tcPr>
+            <w:tcW w:type="dxa" w:w="1469"/>
+          </w:tcPr>
+          <w:p>
+            <w:r/>
+            <w:r>
+              <w:rPr>
+                <w:b w:val="0"/>
+                <w:sz w:val="15"/>
+              </w:rPr>
+              <w:t>0.965 / 0.966</w:t>
+            </w:r>
+          </w:p>
+        </w:tc>
+        <w:tc>
+          <w:tcPr>
+            <w:tcW w:type="dxa" w:w="1296"/>
+          </w:tcPr>
+          <w:p>
+            <w:r/>
+            <w:r>
+              <w:rPr>
+                <w:b w:val="0"/>
+                <w:sz w:val="15"/>
+              </w:rPr>
+              <w:t>0.023 / 0.023</w:t>
+            </w:r>
+          </w:p>
+        </w:tc>
+        <w:tc>
+          <w:tcPr>
             <w:tcW w:type="dxa" w:w="720"/>
           </w:tcPr>
           <w:p>
@@ -1433,24 +1479,9 @@
             <w:r>
               <w:rPr>
                 <w:b w:val="0"/>
-                <w:sz w:val="16"/>
-              </w:rPr>
-              <w:t>0.67</w:t>
-            </w:r>
-          </w:p>
-        </w:tc>
-        <w:tc>
-          <w:tcPr>
-            <w:tcW w:type="dxa" w:w="1656"/>
-          </w:tcPr>
-          <w:p>
-            <w:r/>
-            <w:r>
-              <w:rPr>
-                <w:b w:val="0"/>
-                <w:sz w:val="16"/>
-              </w:rPr>
-              <w:t>0.965 / 0.966</w:t>
+                <w:sz w:val="15"/>
+              </w:rPr>
+              <w:t>0.024</w:t>
             </w:r>
           </w:p>
         </w:tc>
@@ -1463,37 +1494,7 @@
             <w:r>
               <w:rPr>
                 <w:b w:val="0"/>
-                <w:sz w:val="16"/>
-              </w:rPr>
-              <w:t>0.023 / 0.023</w:t>
-            </w:r>
-          </w:p>
-        </w:tc>
-        <w:tc>
-          <w:tcPr>
-            <w:tcW w:type="dxa" w:w="864"/>
-          </w:tcPr>
-          <w:p>
-            <w:r/>
-            <w:r>
-              <w:rPr>
-                <w:b w:val="0"/>
-                <w:sz w:val="16"/>
-              </w:rPr>
-              <w:t>0.024</w:t>
-            </w:r>
-          </w:p>
-        </w:tc>
-        <w:tc>
-          <w:tcPr>
-            <w:tcW w:type="dxa" w:w="1512"/>
-          </w:tcPr>
-          <w:p>
-            <w:r/>
-            <w:r>
-              <w:rPr>
-                <w:b w:val="0"/>
-                <w:sz w:val="16"/>
+                <w:sz w:val="15"/>
               </w:rPr>
               <w:t>0.921 / 0.929</w:t>
             </w:r>
@@ -1501,14 +1502,14 @@
         </w:tc>
         <w:tc>
           <w:tcPr>
-            <w:tcW w:type="dxa" w:w="1512"/>
-          </w:tcPr>
-          <w:p>
-            <w:r/>
-            <w:r>
-              <w:rPr>
-                <w:b w:val="0"/>
-                <w:sz w:val="16"/>
+            <w:tcW w:type="dxa" w:w="1440"/>
+          </w:tcPr>
+          <w:p>
+            <w:r/>
+            <w:r>
+              <w:rPr>
+                <w:b w:val="0"/>
+                <w:sz w:val="15"/>
               </w:rPr>
               <w:t>0.889 / 0.897</w:t>
             </w:r>
@@ -1518,14 +1519,14 @@
       <w:tr>
         <w:tc>
           <w:tcPr>
-            <w:tcW w:type="dxa" w:w="1080"/>
-          </w:tcPr>
-          <w:p>
-            <w:r/>
-            <w:r>
-              <w:rPr>
-                <w:b w:val="0"/>
-                <w:sz w:val="16"/>
+            <w:tcW w:type="dxa" w:w="893"/>
+          </w:tcPr>
+          <w:p>
+            <w:r/>
+            <w:r>
+              <w:rPr>
+                <w:b w:val="0"/>
+                <w:sz w:val="15"/>
               </w:rPr>
               <w:t>200</w:t>
             </w:r>
@@ -1533,14 +1534,14 @@
         </w:tc>
         <w:tc>
           <w:tcPr>
-            <w:tcW w:type="dxa" w:w="1008"/>
-          </w:tcPr>
-          <w:p>
-            <w:r/>
-            <w:r>
-              <w:rPr>
-                <w:b w:val="0"/>
-                <w:sz w:val="16"/>
+            <w:tcW w:type="dxa" w:w="835"/>
+          </w:tcPr>
+          <w:p>
+            <w:r/>
+            <w:r>
+              <w:rPr>
+                <w:b w:val="0"/>
+                <w:sz w:val="15"/>
               </w:rPr>
               <w:t>0.002</w:t>
             </w:r>
@@ -1548,6 +1549,51 @@
         </w:tc>
         <w:tc>
           <w:tcPr>
+            <w:tcW w:type="dxa" w:w="605"/>
+          </w:tcPr>
+          <w:p>
+            <w:r/>
+            <w:r>
+              <w:rPr>
+                <w:b w:val="0"/>
+                <w:sz w:val="15"/>
+              </w:rPr>
+              <w:t>0.80</w:t>
+            </w:r>
+          </w:p>
+        </w:tc>
+        <w:tc>
+          <w:tcPr>
+            <w:tcW w:type="dxa" w:w="1469"/>
+          </w:tcPr>
+          <w:p>
+            <w:r/>
+            <w:r>
+              <w:rPr>
+                <w:b w:val="0"/>
+                <w:sz w:val="15"/>
+              </w:rPr>
+              <w:t>0.973 / 0.973</w:t>
+            </w:r>
+          </w:p>
+        </w:tc>
+        <w:tc>
+          <w:tcPr>
+            <w:tcW w:type="dxa" w:w="1296"/>
+          </w:tcPr>
+          <w:p>
+            <w:r/>
+            <w:r>
+              <w:rPr>
+                <w:b w:val="0"/>
+                <w:sz w:val="15"/>
+              </w:rPr>
+              <w:t>0.015 / 0.015</w:t>
+            </w:r>
+          </w:p>
+        </w:tc>
+        <w:tc>
+          <w:tcPr>
             <w:tcW w:type="dxa" w:w="720"/>
           </w:tcPr>
           <w:p>
@@ -1555,24 +1601,9 @@
             <w:r>
               <w:rPr>
                 <w:b w:val="0"/>
-                <w:sz w:val="16"/>
-              </w:rPr>
-              <w:t>0.80</w:t>
-            </w:r>
-          </w:p>
-        </w:tc>
-        <w:tc>
-          <w:tcPr>
-            <w:tcW w:type="dxa" w:w="1656"/>
-          </w:tcPr>
-          <w:p>
-            <w:r/>
-            <w:r>
-              <w:rPr>
-                <w:b w:val="0"/>
-                <w:sz w:val="16"/>
-              </w:rPr>
-              <w:t>0.973 / 0.973</w:t>
+                <w:sz w:val="15"/>
+              </w:rPr>
+              <w:t>0.024</w:t>
             </w:r>
           </w:p>
         </w:tc>
@@ -1585,37 +1616,7 @@
             <w:r>
               <w:rPr>
                 <w:b w:val="0"/>
-                <w:sz w:val="16"/>
-              </w:rPr>
-              <w:t>0.015 / 0.015</w:t>
-            </w:r>
-          </w:p>
-        </w:tc>
-        <w:tc>
-          <w:tcPr>
-            <w:tcW w:type="dxa" w:w="864"/>
-          </w:tcPr>
-          <w:p>
-            <w:r/>
-            <w:r>
-              <w:rPr>
-                <w:b w:val="0"/>
-                <w:sz w:val="16"/>
-              </w:rPr>
-              <w:t>0.024</w:t>
-            </w:r>
-          </w:p>
-        </w:tc>
-        <w:tc>
-          <w:tcPr>
-            <w:tcW w:type="dxa" w:w="1512"/>
-          </w:tcPr>
-          <w:p>
-            <w:r/>
-            <w:r>
-              <w:rPr>
-                <w:b w:val="0"/>
-                <w:sz w:val="16"/>
+                <w:sz w:val="15"/>
               </w:rPr>
               <w:t>0.918 / 0.926</w:t>
             </w:r>
@@ -1623,14 +1624,14 @@
         </w:tc>
         <w:tc>
           <w:tcPr>
-            <w:tcW w:type="dxa" w:w="1512"/>
-          </w:tcPr>
-          <w:p>
-            <w:r/>
-            <w:r>
-              <w:rPr>
-                <w:b w:val="0"/>
-                <w:sz w:val="16"/>
+            <w:tcW w:type="dxa" w:w="1440"/>
+          </w:tcPr>
+          <w:p>
+            <w:r/>
+            <w:r>
+              <w:rPr>
+                <w:b w:val="0"/>
+                <w:sz w:val="15"/>
               </w:rPr>
               <w:t>0.893 / 0.902</w:t>
             </w:r>
@@ -1640,14 +1641,14 @@
       <w:tr>
         <w:tc>
           <w:tcPr>
-            <w:tcW w:type="dxa" w:w="1080"/>
-          </w:tcPr>
-          <w:p>
-            <w:r/>
-            <w:r>
-              <w:rPr>
-                <w:b w:val="0"/>
-                <w:sz w:val="16"/>
+            <w:tcW w:type="dxa" w:w="893"/>
+          </w:tcPr>
+          <w:p>
+            <w:r/>
+            <w:r>
+              <w:rPr>
+                <w:b w:val="0"/>
+                <w:sz w:val="15"/>
               </w:rPr>
               <w:t>200</w:t>
             </w:r>
@@ -1655,14 +1656,14 @@
         </w:tc>
         <w:tc>
           <w:tcPr>
-            <w:tcW w:type="dxa" w:w="1008"/>
-          </w:tcPr>
-          <w:p>
-            <w:r/>
-            <w:r>
-              <w:rPr>
-                <w:b w:val="0"/>
-                <w:sz w:val="16"/>
+            <w:tcW w:type="dxa" w:w="835"/>
+          </w:tcPr>
+          <w:p>
+            <w:r/>
+            <w:r>
+              <w:rPr>
+                <w:b w:val="0"/>
+                <w:sz w:val="15"/>
               </w:rPr>
               <w:t>0.002</w:t>
             </w:r>
@@ -1670,6 +1671,51 @@
         </w:tc>
         <w:tc>
           <w:tcPr>
+            <w:tcW w:type="dxa" w:w="605"/>
+          </w:tcPr>
+          <w:p>
+            <w:r/>
+            <w:r>
+              <w:rPr>
+                <w:b w:val="0"/>
+                <w:sz w:val="15"/>
+              </w:rPr>
+              <w:t>0.90</w:t>
+            </w:r>
+          </w:p>
+        </w:tc>
+        <w:tc>
+          <w:tcPr>
+            <w:tcW w:type="dxa" w:w="1469"/>
+          </w:tcPr>
+          <w:p>
+            <w:r/>
+            <w:r>
+              <w:rPr>
+                <w:b w:val="0"/>
+                <w:sz w:val="15"/>
+              </w:rPr>
+              <w:t>0.978 / 0.979</w:t>
+            </w:r>
+          </w:p>
+        </w:tc>
+        <w:tc>
+          <w:tcPr>
+            <w:tcW w:type="dxa" w:w="1296"/>
+          </w:tcPr>
+          <w:p>
+            <w:r/>
+            <w:r>
+              <w:rPr>
+                <w:b w:val="0"/>
+                <w:sz w:val="15"/>
+              </w:rPr>
+              <w:t>0.010 / 0.010</w:t>
+            </w:r>
+          </w:p>
+        </w:tc>
+        <w:tc>
+          <w:tcPr>
             <w:tcW w:type="dxa" w:w="720"/>
           </w:tcPr>
           <w:p>
@@ -1677,24 +1723,9 @@
             <w:r>
               <w:rPr>
                 <w:b w:val="0"/>
-                <w:sz w:val="16"/>
-              </w:rPr>
-              <w:t>0.90</w:t>
-            </w:r>
-          </w:p>
-        </w:tc>
-        <w:tc>
-          <w:tcPr>
-            <w:tcW w:type="dxa" w:w="1656"/>
-          </w:tcPr>
-          <w:p>
-            <w:r/>
-            <w:r>
-              <w:rPr>
-                <w:b w:val="0"/>
-                <w:sz w:val="16"/>
-              </w:rPr>
-              <w:t>0.978 / 0.979</w:t>
+                <w:sz w:val="15"/>
+              </w:rPr>
+              <w:t>0.024</w:t>
             </w:r>
           </w:p>
         </w:tc>
@@ -1707,37 +1738,7 @@
             <w:r>
               <w:rPr>
                 <w:b w:val="0"/>
-                <w:sz w:val="16"/>
-              </w:rPr>
-              <w:t>0.010 / 0.010</w:t>
-            </w:r>
-          </w:p>
-        </w:tc>
-        <w:tc>
-          <w:tcPr>
-            <w:tcW w:type="dxa" w:w="864"/>
-          </w:tcPr>
-          <w:p>
-            <w:r/>
-            <w:r>
-              <w:rPr>
-                <w:b w:val="0"/>
-                <w:sz w:val="16"/>
-              </w:rPr>
-              <w:t>0.024</w:t>
-            </w:r>
-          </w:p>
-        </w:tc>
-        <w:tc>
-          <w:tcPr>
-            <w:tcW w:type="dxa" w:w="1512"/>
-          </w:tcPr>
-          <w:p>
-            <w:r/>
-            <w:r>
-              <w:rPr>
-                <w:b w:val="0"/>
-                <w:sz w:val="16"/>
+                <w:sz w:val="15"/>
               </w:rPr>
               <w:t>0.916 / 0.924</w:t>
             </w:r>
@@ -1745,14 +1746,14 @@
         </w:tc>
         <w:tc>
           <w:tcPr>
-            <w:tcW w:type="dxa" w:w="1512"/>
-          </w:tcPr>
-          <w:p>
-            <w:r/>
-            <w:r>
-              <w:rPr>
-                <w:b w:val="0"/>
-                <w:sz w:val="16"/>
+            <w:tcW w:type="dxa" w:w="1440"/>
+          </w:tcPr>
+          <w:p>
+            <w:r/>
+            <w:r>
+              <w:rPr>
+                <w:b w:val="0"/>
+                <w:sz w:val="15"/>
               </w:rPr>
               <w:t>0.896 / 0.905</w:t>
             </w:r>
@@ -1762,14 +1763,14 @@
       <w:tr>
         <w:tc>
           <w:tcPr>
-            <w:tcW w:type="dxa" w:w="1080"/>
-          </w:tcPr>
-          <w:p>
-            <w:r/>
-            <w:r>
-              <w:rPr>
-                <w:b w:val="0"/>
-                <w:sz w:val="16"/>
+            <w:tcW w:type="dxa" w:w="893"/>
+          </w:tcPr>
+          <w:p>
+            <w:r/>
+            <w:r>
+              <w:rPr>
+                <w:b w:val="0"/>
+                <w:sz w:val="15"/>
               </w:rPr>
               <w:t>300</w:t>
             </w:r>
@@ -1777,14 +1778,14 @@
         </w:tc>
         <w:tc>
           <w:tcPr>
-            <w:tcW w:type="dxa" w:w="1008"/>
-          </w:tcPr>
-          <w:p>
-            <w:r/>
-            <w:r>
-              <w:rPr>
-                <w:b w:val="0"/>
-                <w:sz w:val="16"/>
+            <w:tcW w:type="dxa" w:w="835"/>
+          </w:tcPr>
+          <w:p>
+            <w:r/>
+            <w:r>
+              <w:rPr>
+                <w:b w:val="0"/>
+                <w:sz w:val="15"/>
               </w:rPr>
               <w:t>0.0032</w:t>
             </w:r>
@@ -1792,6 +1793,51 @@
         </w:tc>
         <w:tc>
           <w:tcPr>
+            <w:tcW w:type="dxa" w:w="605"/>
+          </w:tcPr>
+          <w:p>
+            <w:r/>
+            <w:r>
+              <w:rPr>
+                <w:b w:val="0"/>
+                <w:sz w:val="15"/>
+              </w:rPr>
+              <w:t>0.67</w:t>
+            </w:r>
+          </w:p>
+        </w:tc>
+        <w:tc>
+          <w:tcPr>
+            <w:tcW w:type="dxa" w:w="1469"/>
+          </w:tcPr>
+          <w:p>
+            <w:r/>
+            <w:r>
+              <w:rPr>
+                <w:b w:val="0"/>
+                <w:sz w:val="15"/>
+              </w:rPr>
+              <w:t>0.979 / 0.981</w:t>
+            </w:r>
+          </w:p>
+        </w:tc>
+        <w:tc>
+          <w:tcPr>
+            <w:tcW w:type="dxa" w:w="1296"/>
+          </w:tcPr>
+          <w:p>
+            <w:r/>
+            <w:r>
+              <w:rPr>
+                <w:b w:val="0"/>
+                <w:sz w:val="15"/>
+              </w:rPr>
+              <w:t>0.004 / 0.003</w:t>
+            </w:r>
+          </w:p>
+        </w:tc>
+        <w:tc>
+          <w:tcPr>
             <w:tcW w:type="dxa" w:w="720"/>
           </w:tcPr>
           <w:p>
@@ -1799,24 +1845,9 @@
             <w:r>
               <w:rPr>
                 <w:b w:val="0"/>
-                <w:sz w:val="16"/>
-              </w:rPr>
-              <w:t>0.67</w:t>
-            </w:r>
-          </w:p>
-        </w:tc>
-        <w:tc>
-          <w:tcPr>
-            <w:tcW w:type="dxa" w:w="1656"/>
-          </w:tcPr>
-          <w:p>
-            <w:r/>
-            <w:r>
-              <w:rPr>
-                <w:b w:val="0"/>
-                <w:sz w:val="16"/>
-              </w:rPr>
-              <w:t>0.979 / 0.981</w:t>
+                <w:sz w:val="15"/>
+              </w:rPr>
+              <w:t>0.029</w:t>
             </w:r>
           </w:p>
         </w:tc>
@@ -1829,37 +1860,7 @@
             <w:r>
               <w:rPr>
                 <w:b w:val="0"/>
-                <w:sz w:val="16"/>
-              </w:rPr>
-              <w:t>0.004 / 0.003</w:t>
-            </w:r>
-          </w:p>
-        </w:tc>
-        <w:tc>
-          <w:tcPr>
-            <w:tcW w:type="dxa" w:w="864"/>
-          </w:tcPr>
-          <w:p>
-            <w:r/>
-            <w:r>
-              <w:rPr>
-                <w:b w:val="0"/>
-                <w:sz w:val="16"/>
-              </w:rPr>
-              <w:t>0.029</w:t>
-            </w:r>
-          </w:p>
-        </w:tc>
-        <w:tc>
-          <w:tcPr>
-            <w:tcW w:type="dxa" w:w="1512"/>
-          </w:tcPr>
-          <w:p>
-            <w:r/>
-            <w:r>
-              <w:rPr>
-                <w:b w:val="0"/>
-                <w:sz w:val="16"/>
+                <w:sz w:val="15"/>
               </w:rPr>
               <w:t>0.901 / 0.907</w:t>
             </w:r>
@@ -1867,14 +1868,14 @@
         </w:tc>
         <w:tc>
           <w:tcPr>
-            <w:tcW w:type="dxa" w:w="1512"/>
-          </w:tcPr>
-          <w:p>
-            <w:r/>
-            <w:r>
-              <w:rPr>
-                <w:b w:val="0"/>
-                <w:sz w:val="16"/>
+            <w:tcW w:type="dxa" w:w="1440"/>
+          </w:tcPr>
+          <w:p>
+            <w:r/>
+            <w:r>
+              <w:rPr>
+                <w:b w:val="0"/>
+                <w:sz w:val="15"/>
               </w:rPr>
               <w:t>0.883 / 0.890</w:t>
             </w:r>
@@ -1884,14 +1885,14 @@
       <w:tr>
         <w:tc>
           <w:tcPr>
-            <w:tcW w:type="dxa" w:w="1080"/>
-          </w:tcPr>
-          <w:p>
-            <w:r/>
-            <w:r>
-              <w:rPr>
-                <w:b w:val="0"/>
-                <w:sz w:val="16"/>
+            <w:tcW w:type="dxa" w:w="893"/>
+          </w:tcPr>
+          <w:p>
+            <w:r/>
+            <w:r>
+              <w:rPr>
+                <w:b w:val="0"/>
+                <w:sz w:val="15"/>
               </w:rPr>
               <w:t>300</w:t>
             </w:r>
@@ -1899,14 +1900,14 @@
         </w:tc>
         <w:tc>
           <w:tcPr>
-            <w:tcW w:type="dxa" w:w="1008"/>
-          </w:tcPr>
-          <w:p>
-            <w:r/>
-            <w:r>
-              <w:rPr>
-                <w:b w:val="0"/>
-                <w:sz w:val="16"/>
+            <w:tcW w:type="dxa" w:w="835"/>
+          </w:tcPr>
+          <w:p>
+            <w:r/>
+            <w:r>
+              <w:rPr>
+                <w:b w:val="0"/>
+                <w:sz w:val="15"/>
               </w:rPr>
               <w:t>0.0032</w:t>
             </w:r>
@@ -1914,6 +1915,51 @@
         </w:tc>
         <w:tc>
           <w:tcPr>
+            <w:tcW w:type="dxa" w:w="605"/>
+          </w:tcPr>
+          <w:p>
+            <w:r/>
+            <w:r>
+              <w:rPr>
+                <w:b w:val="0"/>
+                <w:sz w:val="15"/>
+              </w:rPr>
+              <w:t>0.80</w:t>
+            </w:r>
+          </w:p>
+        </w:tc>
+        <w:tc>
+          <w:tcPr>
+            <w:tcW w:type="dxa" w:w="1469"/>
+          </w:tcPr>
+          <w:p>
+            <w:r/>
+            <w:r>
+              <w:rPr>
+                <w:b w:val="0"/>
+                <w:sz w:val="15"/>
+              </w:rPr>
+              <w:t>0.980 / 0.981</w:t>
+            </w:r>
+          </w:p>
+        </w:tc>
+        <w:tc>
+          <w:tcPr>
+            <w:tcW w:type="dxa" w:w="1296"/>
+          </w:tcPr>
+          <w:p>
+            <w:r/>
+            <w:r>
+              <w:rPr>
+                <w:b w:val="0"/>
+                <w:sz w:val="15"/>
+              </w:rPr>
+              <w:t>0.003 / 0.002</w:t>
+            </w:r>
+          </w:p>
+        </w:tc>
+        <w:tc>
+          <w:tcPr>
             <w:tcW w:type="dxa" w:w="720"/>
           </w:tcPr>
           <w:p>
@@ -1921,24 +1967,9 @@
             <w:r>
               <w:rPr>
                 <w:b w:val="0"/>
-                <w:sz w:val="16"/>
-              </w:rPr>
-              <w:t>0.80</w:t>
-            </w:r>
-          </w:p>
-        </w:tc>
-        <w:tc>
-          <w:tcPr>
-            <w:tcW w:type="dxa" w:w="1656"/>
-          </w:tcPr>
-          <w:p>
-            <w:r/>
-            <w:r>
-              <w:rPr>
-                <w:b w:val="0"/>
-                <w:sz w:val="16"/>
-              </w:rPr>
-              <w:t>0.980 / 0.981</w:t>
+                <w:sz w:val="15"/>
+              </w:rPr>
+              <w:t>0.029</w:t>
             </w:r>
           </w:p>
         </w:tc>
@@ -1951,37 +1982,7 @@
             <w:r>
               <w:rPr>
                 <w:b w:val="0"/>
-                <w:sz w:val="16"/>
-              </w:rPr>
-              <w:t>0.003 / 0.002</w:t>
-            </w:r>
-          </w:p>
-        </w:tc>
-        <w:tc>
-          <w:tcPr>
-            <w:tcW w:type="dxa" w:w="864"/>
-          </w:tcPr>
-          <w:p>
-            <w:r/>
-            <w:r>
-              <w:rPr>
-                <w:b w:val="0"/>
-                <w:sz w:val="16"/>
-              </w:rPr>
-              <w:t>0.029</w:t>
-            </w:r>
-          </w:p>
-        </w:tc>
-        <w:tc>
-          <w:tcPr>
-            <w:tcW w:type="dxa" w:w="1512"/>
-          </w:tcPr>
-          <w:p>
-            <w:r/>
-            <w:r>
-              <w:rPr>
-                <w:b w:val="0"/>
-                <w:sz w:val="16"/>
+                <w:sz w:val="15"/>
               </w:rPr>
               <w:t>0.896 / 0.903</w:t>
             </w:r>
@@ -1989,14 +1990,14 @@
         </w:tc>
         <w:tc>
           <w:tcPr>
-            <w:tcW w:type="dxa" w:w="1512"/>
-          </w:tcPr>
-          <w:p>
-            <w:r/>
-            <w:r>
-              <w:rPr>
-                <w:b w:val="0"/>
-                <w:sz w:val="16"/>
+            <w:tcW w:type="dxa" w:w="1440"/>
+          </w:tcPr>
+          <w:p>
+            <w:r/>
+            <w:r>
+              <w:rPr>
+                <w:b w:val="0"/>
+                <w:sz w:val="15"/>
               </w:rPr>
               <w:t>0.879 / 0.886</w:t>
             </w:r>
@@ -2006,14 +2007,14 @@
       <w:tr>
         <w:tc>
           <w:tcPr>
-            <w:tcW w:type="dxa" w:w="1080"/>
-          </w:tcPr>
-          <w:p>
-            <w:r/>
-            <w:r>
-              <w:rPr>
-                <w:b w:val="0"/>
-                <w:sz w:val="16"/>
+            <w:tcW w:type="dxa" w:w="893"/>
+          </w:tcPr>
+          <w:p>
+            <w:r/>
+            <w:r>
+              <w:rPr>
+                <w:b w:val="0"/>
+                <w:sz w:val="15"/>
               </w:rPr>
               <w:t>300</w:t>
             </w:r>
@@ -2021,14 +2022,14 @@
         </w:tc>
         <w:tc>
           <w:tcPr>
-            <w:tcW w:type="dxa" w:w="1008"/>
-          </w:tcPr>
-          <w:p>
-            <w:r/>
-            <w:r>
-              <w:rPr>
-                <w:b w:val="0"/>
-                <w:sz w:val="16"/>
+            <w:tcW w:type="dxa" w:w="835"/>
+          </w:tcPr>
+          <w:p>
+            <w:r/>
+            <w:r>
+              <w:rPr>
+                <w:b w:val="0"/>
+                <w:sz w:val="15"/>
               </w:rPr>
               <w:t>0.0032</w:t>
             </w:r>
@@ -2036,6 +2037,51 @@
         </w:tc>
         <w:tc>
           <w:tcPr>
+            <w:tcW w:type="dxa" w:w="605"/>
+          </w:tcPr>
+          <w:p>
+            <w:r/>
+            <w:r>
+              <w:rPr>
+                <w:b w:val="0"/>
+                <w:sz w:val="15"/>
+              </w:rPr>
+              <w:t>0.90</w:t>
+            </w:r>
+          </w:p>
+        </w:tc>
+        <w:tc>
+          <w:tcPr>
+            <w:tcW w:type="dxa" w:w="1469"/>
+          </w:tcPr>
+          <w:p>
+            <w:r/>
+            <w:r>
+              <w:rPr>
+                <w:b w:val="0"/>
+                <w:sz w:val="15"/>
+              </w:rPr>
+              <w:t>0.981 / 0.982</w:t>
+            </w:r>
+          </w:p>
+        </w:tc>
+        <w:tc>
+          <w:tcPr>
+            <w:tcW w:type="dxa" w:w="1296"/>
+          </w:tcPr>
+          <w:p>
+            <w:r/>
+            <w:r>
+              <w:rPr>
+                <w:b w:val="0"/>
+                <w:sz w:val="15"/>
+              </w:rPr>
+              <w:t>0.002 / 0.001</w:t>
+            </w:r>
+          </w:p>
+        </w:tc>
+        <w:tc>
+          <w:tcPr>
             <w:tcW w:type="dxa" w:w="720"/>
           </w:tcPr>
           <w:p>
@@ -2043,24 +2089,9 @@
             <w:r>
               <w:rPr>
                 <w:b w:val="0"/>
-                <w:sz w:val="16"/>
-              </w:rPr>
-              <w:t>0.90</w:t>
-            </w:r>
-          </w:p>
-        </w:tc>
-        <w:tc>
-          <w:tcPr>
-            <w:tcW w:type="dxa" w:w="1656"/>
-          </w:tcPr>
-          <w:p>
-            <w:r/>
-            <w:r>
-              <w:rPr>
-                <w:b w:val="0"/>
-                <w:sz w:val="16"/>
-              </w:rPr>
-              <w:t>0.981 / 0.982</w:t>
+                <w:sz w:val="15"/>
+              </w:rPr>
+              <w:t>0.029</w:t>
             </w:r>
           </w:p>
         </w:tc>
@@ -2073,37 +2104,7 @@
             <w:r>
               <w:rPr>
                 <w:b w:val="0"/>
-                <w:sz w:val="16"/>
-              </w:rPr>
-              <w:t>0.002 / 0.001</w:t>
-            </w:r>
-          </w:p>
-        </w:tc>
-        <w:tc>
-          <w:tcPr>
-            <w:tcW w:type="dxa" w:w="864"/>
-          </w:tcPr>
-          <w:p>
-            <w:r/>
-            <w:r>
-              <w:rPr>
-                <w:b w:val="0"/>
-                <w:sz w:val="16"/>
-              </w:rPr>
-              <w:t>0.029</w:t>
-            </w:r>
-          </w:p>
-        </w:tc>
-        <w:tc>
-          <w:tcPr>
-            <w:tcW w:type="dxa" w:w="1512"/>
-          </w:tcPr>
-          <w:p>
-            <w:r/>
-            <w:r>
-              <w:rPr>
-                <w:b w:val="0"/>
-                <w:sz w:val="16"/>
+                <w:sz w:val="15"/>
               </w:rPr>
               <w:t>0.893 / 0.900</w:t>
             </w:r>
@@ -2111,14 +2112,14 @@
         </w:tc>
         <w:tc>
           <w:tcPr>
-            <w:tcW w:type="dxa" w:w="1512"/>
-          </w:tcPr>
-          <w:p>
-            <w:r/>
-            <w:r>
-              <w:rPr>
-                <w:b w:val="0"/>
-                <w:sz w:val="16"/>
+            <w:tcW w:type="dxa" w:w="1440"/>
+          </w:tcPr>
+          <w:p>
+            <w:r/>
+            <w:r>
+              <w:rPr>
+                <w:b w:val="0"/>
+                <w:sz w:val="15"/>
               </w:rPr>
               <w:t>0.876 / 0.883</w:t>
             </w:r>
@@ -2128,14 +2129,14 @@
       <w:tr>
         <w:tc>
           <w:tcPr>
-            <w:tcW w:type="dxa" w:w="1080"/>
-          </w:tcPr>
-          <w:p>
-            <w:r/>
-            <w:r>
-              <w:rPr>
-                <w:b w:val="0"/>
-                <w:sz w:val="16"/>
+            <w:tcW w:type="dxa" w:w="893"/>
+          </w:tcPr>
+          <w:p>
+            <w:r/>
+            <w:r>
+              <w:rPr>
+                <w:b w:val="0"/>
+                <w:sz w:val="15"/>
               </w:rPr>
               <w:t>300</w:t>
             </w:r>
@@ -2143,14 +2144,14 @@
         </w:tc>
         <w:tc>
           <w:tcPr>
-            <w:tcW w:type="dxa" w:w="1008"/>
-          </w:tcPr>
-          <w:p>
-            <w:r/>
-            <w:r>
-              <w:rPr>
-                <w:b w:val="0"/>
-                <w:sz w:val="16"/>
+            <w:tcW w:type="dxa" w:w="835"/>
+          </w:tcPr>
+          <w:p>
+            <w:r/>
+            <w:r>
+              <w:rPr>
+                <w:b w:val="0"/>
+                <w:sz w:val="15"/>
               </w:rPr>
               <w:t>0.002</w:t>
             </w:r>
@@ -2158,6 +2159,51 @@
         </w:tc>
         <w:tc>
           <w:tcPr>
+            <w:tcW w:type="dxa" w:w="605"/>
+          </w:tcPr>
+          <w:p>
+            <w:r/>
+            <w:r>
+              <w:rPr>
+                <w:b w:val="0"/>
+                <w:sz w:val="15"/>
+              </w:rPr>
+              <w:t>0.67</w:t>
+            </w:r>
+          </w:p>
+        </w:tc>
+        <w:tc>
+          <w:tcPr>
+            <w:tcW w:type="dxa" w:w="1469"/>
+          </w:tcPr>
+          <w:p>
+            <w:r/>
+            <w:r>
+              <w:rPr>
+                <w:b w:val="0"/>
+                <w:sz w:val="15"/>
+              </w:rPr>
+              <w:t>0.983 / 0.984</w:t>
+            </w:r>
+          </w:p>
+        </w:tc>
+        <w:tc>
+          <w:tcPr>
+            <w:tcW w:type="dxa" w:w="1296"/>
+          </w:tcPr>
+          <w:p>
+            <w:r/>
+            <w:r>
+              <w:rPr>
+                <w:b w:val="0"/>
+                <w:sz w:val="15"/>
+              </w:rPr>
+              <w:t>0.004 / 0.003</w:t>
+            </w:r>
+          </w:p>
+        </w:tc>
+        <w:tc>
+          <w:tcPr>
             <w:tcW w:type="dxa" w:w="720"/>
           </w:tcPr>
           <w:p>
@@ -2165,24 +2211,9 @@
             <w:r>
               <w:rPr>
                 <w:b w:val="0"/>
-                <w:sz w:val="16"/>
-              </w:rPr>
-              <w:t>0.67</w:t>
-            </w:r>
-          </w:p>
-        </w:tc>
-        <w:tc>
-          <w:tcPr>
-            <w:tcW w:type="dxa" w:w="1656"/>
-          </w:tcPr>
-          <w:p>
-            <w:r/>
-            <w:r>
-              <w:rPr>
-                <w:b w:val="0"/>
-                <w:sz w:val="16"/>
-              </w:rPr>
-              <w:t>0.983 / 0.984</w:t>
+                <w:sz w:val="15"/>
+              </w:rPr>
+              <w:t>0.024</w:t>
             </w:r>
           </w:p>
         </w:tc>
@@ -2195,37 +2226,7 @@
             <w:r>
               <w:rPr>
                 <w:b w:val="0"/>
-                <w:sz w:val="16"/>
-              </w:rPr>
-              <w:t>0.004 / 0.003</w:t>
-            </w:r>
-          </w:p>
-        </w:tc>
-        <w:tc>
-          <w:tcPr>
-            <w:tcW w:type="dxa" w:w="864"/>
-          </w:tcPr>
-          <w:p>
-            <w:r/>
-            <w:r>
-              <w:rPr>
-                <w:b w:val="0"/>
-                <w:sz w:val="16"/>
-              </w:rPr>
-              <w:t>0.024</w:t>
-            </w:r>
-          </w:p>
-        </w:tc>
-        <w:tc>
-          <w:tcPr>
-            <w:tcW w:type="dxa" w:w="1512"/>
-          </w:tcPr>
-          <w:p>
-            <w:r/>
-            <w:r>
-              <w:rPr>
-                <w:b w:val="0"/>
-                <w:sz w:val="16"/>
+                <w:sz w:val="15"/>
               </w:rPr>
               <w:t>0.921 / 0.927</w:t>
             </w:r>
@@ -2233,14 +2234,14 @@
         </w:tc>
         <w:tc>
           <w:tcPr>
-            <w:tcW w:type="dxa" w:w="1512"/>
-          </w:tcPr>
-          <w:p>
-            <w:r/>
-            <w:r>
-              <w:rPr>
-                <w:b w:val="0"/>
-                <w:sz w:val="16"/>
+            <w:tcW w:type="dxa" w:w="1440"/>
+          </w:tcPr>
+          <w:p>
+            <w:r/>
+            <w:r>
+              <w:rPr>
+                <w:b w:val="0"/>
+                <w:sz w:val="15"/>
               </w:rPr>
               <w:t>0.905 / 0.912</w:t>
             </w:r>
@@ -2250,14 +2251,14 @@
       <w:tr>
         <w:tc>
           <w:tcPr>
-            <w:tcW w:type="dxa" w:w="1080"/>
-          </w:tcPr>
-          <w:p>
-            <w:r/>
-            <w:r>
-              <w:rPr>
-                <w:b w:val="0"/>
-                <w:sz w:val="16"/>
+            <w:tcW w:type="dxa" w:w="893"/>
+          </w:tcPr>
+          <w:p>
+            <w:r/>
+            <w:r>
+              <w:rPr>
+                <w:b w:val="0"/>
+                <w:sz w:val="15"/>
               </w:rPr>
               <w:t>300</w:t>
             </w:r>
@@ -2265,14 +2266,14 @@
         </w:tc>
         <w:tc>
           <w:tcPr>
-            <w:tcW w:type="dxa" w:w="1008"/>
-          </w:tcPr>
-          <w:p>
-            <w:r/>
-            <w:r>
-              <w:rPr>
-                <w:b w:val="0"/>
-                <w:sz w:val="16"/>
+            <w:tcW w:type="dxa" w:w="835"/>
+          </w:tcPr>
+          <w:p>
+            <w:r/>
+            <w:r>
+              <w:rPr>
+                <w:b w:val="0"/>
+                <w:sz w:val="15"/>
               </w:rPr>
               <w:t>0.002</w:t>
             </w:r>
@@ -2280,6 +2281,51 @@
         </w:tc>
         <w:tc>
           <w:tcPr>
+            <w:tcW w:type="dxa" w:w="605"/>
+          </w:tcPr>
+          <w:p>
+            <w:r/>
+            <w:r>
+              <w:rPr>
+                <w:b w:val="0"/>
+                <w:sz w:val="15"/>
+              </w:rPr>
+              <w:t>0.80</w:t>
+            </w:r>
+          </w:p>
+        </w:tc>
+        <w:tc>
+          <w:tcPr>
+            <w:tcW w:type="dxa" w:w="1469"/>
+          </w:tcPr>
+          <w:p>
+            <w:r/>
+            <w:r>
+              <w:rPr>
+                <w:b w:val="0"/>
+                <w:sz w:val="15"/>
+              </w:rPr>
+              <w:t>0.984 / 0.984</w:t>
+            </w:r>
+          </w:p>
+        </w:tc>
+        <w:tc>
+          <w:tcPr>
+            <w:tcW w:type="dxa" w:w="1296"/>
+          </w:tcPr>
+          <w:p>
+            <w:r/>
+            <w:r>
+              <w:rPr>
+                <w:b w:val="0"/>
+                <w:sz w:val="15"/>
+              </w:rPr>
+              <w:t>0.003 / 0.002</w:t>
+            </w:r>
+          </w:p>
+        </w:tc>
+        <w:tc>
+          <w:tcPr>
             <w:tcW w:type="dxa" w:w="720"/>
           </w:tcPr>
           <w:p>
@@ -2287,24 +2333,9 @@
             <w:r>
               <w:rPr>
                 <w:b w:val="0"/>
-                <w:sz w:val="16"/>
-              </w:rPr>
-              <w:t>0.80</w:t>
-            </w:r>
-          </w:p>
-        </w:tc>
-        <w:tc>
-          <w:tcPr>
-            <w:tcW w:type="dxa" w:w="1656"/>
-          </w:tcPr>
-          <w:p>
-            <w:r/>
-            <w:r>
-              <w:rPr>
-                <w:b w:val="0"/>
-                <w:sz w:val="16"/>
-              </w:rPr>
-              <w:t>0.984 / 0.984</w:t>
+                <w:sz w:val="15"/>
+              </w:rPr>
+              <w:t>0.024</w:t>
             </w:r>
           </w:p>
         </w:tc>
@@ -2317,37 +2348,7 @@
             <w:r>
               <w:rPr>
                 <w:b w:val="0"/>
-                <w:sz w:val="16"/>
-              </w:rPr>
-              <w:t>0.003 / 0.002</w:t>
-            </w:r>
-          </w:p>
-        </w:tc>
-        <w:tc>
-          <w:tcPr>
-            <w:tcW w:type="dxa" w:w="864"/>
-          </w:tcPr>
-          <w:p>
-            <w:r/>
-            <w:r>
-              <w:rPr>
-                <w:b w:val="0"/>
-                <w:sz w:val="16"/>
-              </w:rPr>
-              <w:t>0.024</w:t>
-            </w:r>
-          </w:p>
-        </w:tc>
-        <w:tc>
-          <w:tcPr>
-            <w:tcW w:type="dxa" w:w="1512"/>
-          </w:tcPr>
-          <w:p>
-            <w:r/>
-            <w:r>
-              <w:rPr>
-                <w:b w:val="0"/>
-                <w:sz w:val="16"/>
+                <w:sz w:val="15"/>
               </w:rPr>
               <w:t>0.918 / 0.924</w:t>
             </w:r>
@@ -2355,14 +2356,14 @@
         </w:tc>
         <w:tc>
           <w:tcPr>
-            <w:tcW w:type="dxa" w:w="1512"/>
-          </w:tcPr>
-          <w:p>
-            <w:r/>
-            <w:r>
-              <w:rPr>
-                <w:b w:val="0"/>
-                <w:sz w:val="16"/>
+            <w:tcW w:type="dxa" w:w="1440"/>
+          </w:tcPr>
+          <w:p>
+            <w:r/>
+            <w:r>
+              <w:rPr>
+                <w:b w:val="0"/>
+                <w:sz w:val="15"/>
               </w:rPr>
               <w:t>0.903 / 0.909</w:t>
             </w:r>
@@ -2372,14 +2373,14 @@
       <w:tr>
         <w:tc>
           <w:tcPr>
-            <w:tcW w:type="dxa" w:w="1080"/>
-          </w:tcPr>
-          <w:p>
-            <w:r/>
-            <w:r>
-              <w:rPr>
-                <w:b w:val="0"/>
-                <w:sz w:val="16"/>
+            <w:tcW w:type="dxa" w:w="893"/>
+          </w:tcPr>
+          <w:p>
+            <w:r/>
+            <w:r>
+              <w:rPr>
+                <w:b w:val="0"/>
+                <w:sz w:val="15"/>
               </w:rPr>
               <w:t>300</w:t>
             </w:r>
@@ -2387,14 +2388,14 @@
         </w:tc>
         <w:tc>
           <w:tcPr>
-            <w:tcW w:type="dxa" w:w="1008"/>
-          </w:tcPr>
-          <w:p>
-            <w:r/>
-            <w:r>
-              <w:rPr>
-                <w:b w:val="0"/>
-                <w:sz w:val="16"/>
+            <w:tcW w:type="dxa" w:w="835"/>
+          </w:tcPr>
+          <w:p>
+            <w:r/>
+            <w:r>
+              <w:rPr>
+                <w:b w:val="0"/>
+                <w:sz w:val="15"/>
               </w:rPr>
               <w:t>0.002</w:t>
             </w:r>
@@ -2402,6 +2403,51 @@
         </w:tc>
         <w:tc>
           <w:tcPr>
+            <w:tcW w:type="dxa" w:w="605"/>
+          </w:tcPr>
+          <w:p>
+            <w:r/>
+            <w:r>
+              <w:rPr>
+                <w:b w:val="0"/>
+                <w:sz w:val="15"/>
+              </w:rPr>
+              <w:t>0.90</w:t>
+            </w:r>
+          </w:p>
+        </w:tc>
+        <w:tc>
+          <w:tcPr>
+            <w:tcW w:type="dxa" w:w="1469"/>
+          </w:tcPr>
+          <w:p>
+            <w:r/>
+            <w:r>
+              <w:rPr>
+                <w:b w:val="0"/>
+                <w:sz w:val="15"/>
+              </w:rPr>
+              <w:t>0.984 / 0.985</w:t>
+            </w:r>
+          </w:p>
+        </w:tc>
+        <w:tc>
+          <w:tcPr>
+            <w:tcW w:type="dxa" w:w="1296"/>
+          </w:tcPr>
+          <w:p>
+            <w:r/>
+            <w:r>
+              <w:rPr>
+                <w:b w:val="0"/>
+                <w:sz w:val="15"/>
+              </w:rPr>
+              <w:t>0.002 / 0.001</w:t>
+            </w:r>
+          </w:p>
+        </w:tc>
+        <w:tc>
+          <w:tcPr>
             <w:tcW w:type="dxa" w:w="720"/>
           </w:tcPr>
           <w:p>
@@ -2409,24 +2455,9 @@
             <w:r>
               <w:rPr>
                 <w:b w:val="0"/>
-                <w:sz w:val="16"/>
-              </w:rPr>
-              <w:t>0.90</w:t>
-            </w:r>
-          </w:p>
-        </w:tc>
-        <w:tc>
-          <w:tcPr>
-            <w:tcW w:type="dxa" w:w="1656"/>
-          </w:tcPr>
-          <w:p>
-            <w:r/>
-            <w:r>
-              <w:rPr>
-                <w:b w:val="0"/>
-                <w:sz w:val="16"/>
-              </w:rPr>
-              <w:t>0.984 / 0.985</w:t>
+                <w:sz w:val="15"/>
+              </w:rPr>
+              <w:t>0.024</w:t>
             </w:r>
           </w:p>
         </w:tc>
@@ -2439,37 +2470,7 @@
             <w:r>
               <w:rPr>
                 <w:b w:val="0"/>
-                <w:sz w:val="16"/>
-              </w:rPr>
-              <w:t>0.002 / 0.001</w:t>
-            </w:r>
-          </w:p>
-        </w:tc>
-        <w:tc>
-          <w:tcPr>
-            <w:tcW w:type="dxa" w:w="864"/>
-          </w:tcPr>
-          <w:p>
-            <w:r/>
-            <w:r>
-              <w:rPr>
-                <w:b w:val="0"/>
-                <w:sz w:val="16"/>
-              </w:rPr>
-              <w:t>0.024</w:t>
-            </w:r>
-          </w:p>
-        </w:tc>
-        <w:tc>
-          <w:tcPr>
-            <w:tcW w:type="dxa" w:w="1512"/>
-          </w:tcPr>
-          <w:p>
-            <w:r/>
-            <w:r>
-              <w:rPr>
-                <w:b w:val="0"/>
-                <w:sz w:val="16"/>
+                <w:sz w:val="15"/>
               </w:rPr>
               <w:t>0.915 / 0.921</w:t>
             </w:r>
@@ -2477,14 +2478,14 @@
         </w:tc>
         <w:tc>
           <w:tcPr>
-            <w:tcW w:type="dxa" w:w="1512"/>
-          </w:tcPr>
-          <w:p>
-            <w:r/>
-            <w:r>
-              <w:rPr>
-                <w:b w:val="0"/>
-                <w:sz w:val="16"/>
+            <w:tcW w:type="dxa" w:w="1440"/>
+          </w:tcPr>
+          <w:p>
+            <w:r/>
+            <w:r>
+              <w:rPr>
+                <w:b w:val="0"/>
+                <w:sz w:val="15"/>
               </w:rPr>
               <w:t>0.901 / 0.907</w:t>
             </w:r>

</xml_diff>